<commit_message>
Append OutSystems certificate image to the end of the CV
Add the consolidated OutSystems certifications certificate as the final
page of the Word CV (and PDF generator).

Co-authored-by: myounusm <myounusm@users.noreply.github.com>
</commit_message>
<xml_diff>
--- a/public/Mohammed_Younus_CV.docx
+++ b/public/Mohammed_Younus_CV.docx
@@ -1641,9 +1641,81 @@
         <w:t xml:space="preserve">Curriculum Vitae generated from https://www.myounusm.in · Mohammed Younus Mohiuddin</w:t>
       </w:r>
     </w:p>
+    <w:p>
+      <w:pPr>
+        <w:sectPr>
+          <w:pgSz w:w="11906" w:h="16838" w:orient="portrait"/>
+          <w:pgMar w:top="720" w:right="720" w:bottom="720" w:left="720" w:header="708" w:footer="708" w:gutter="0"/>
+          <w:pgNumType/>
+          <w:docGrid w:linePitch="360"/>
+        </w:sectPr>
+      </w:pPr>
+    </w:p>
+    <w:p>
+      <w:pPr>
+        <w:spacing w:after="120"/>
+        <w:jc w:val="center"/>
+      </w:pPr>
+      <w:r>
+        <w:rPr>
+          <w:rFonts w:ascii="Calibri" w:cs="Calibri" w:eastAsia="Calibri" w:hAnsi="Calibri"/>
+          <w:b/>
+          <w:bCs/>
+          <w:color w:val="0F4D48"/>
+          <w:sz w:val="22"/>
+          <w:szCs w:val="22"/>
+        </w:rPr>
+        <w:t xml:space="preserve">OutSystems Certifications</w:t>
+      </w:r>
+    </w:p>
+    <w:p>
+      <w:pPr>
+        <w:jc w:val="center"/>
+      </w:pPr>
+      <w:r>
+        <w:drawing>
+          <wp:inline distT="0" distB="0" distL="0" distR="0">
+            <wp:extent cx="4953000" cy="7038975"/>
+            <wp:effectExtent t="0" r="0" b="0" l="0"/>
+            <wp:docPr id="1" name="outsystems-certifications" descr="Consolidated OutSystems certification certificate for Mohammed Younus Mohiuddin" title="OutSystems certifications"/>
+            <wp:cNvGraphicFramePr>
+              <a:graphicFrameLocks xmlns:a="http://schemas.openxmlformats.org/drawingml/2006/main" noChangeAspect="1"/>
+            </wp:cNvGraphicFramePr>
+            <a:graphic xmlns:a="http://schemas.openxmlformats.org/drawingml/2006/main">
+              <a:graphicData uri="http://schemas.openxmlformats.org/drawingml/2006/picture">
+                <pic:pic xmlns:pic="http://schemas.openxmlformats.org/drawingml/2006/picture">
+                  <pic:nvPicPr>
+                    <pic:cNvPr id="0" name="" descr=""/>
+                    <pic:cNvPicPr>
+                      <a:picLocks noChangeAspect="1" noChangeArrowheads="1"/>
+                    </pic:cNvPicPr>
+                  </pic:nvPicPr>
+                  <pic:blipFill>
+                    <a:blip r:embed="rId7" cstate="none"/>
+                    <a:srcRect/>
+                    <a:stretch>
+                      <a:fillRect/>
+                    </a:stretch>
+                  </pic:blipFill>
+                  <pic:spPr bwMode="auto">
+                    <a:xfrm>
+                      <a:off x="0" y="0"/>
+                      <a:ext cx="4953000" cy="7038975"/>
+                    </a:xfrm>
+                    <a:prstGeom prst="rect">
+                      <a:avLst/>
+                    </a:prstGeom>
+                  </pic:spPr>
+                </pic:pic>
+              </a:graphicData>
+            </a:graphic>
+          </wp:inline>
+        </w:drawing>
+      </w:r>
+    </w:p>
     <w:sectPr>
       <w:pgSz w:w="11906" w:h="16838" w:orient="portrait"/>
-      <w:pgMar w:top="720" w:right="720" w:bottom="720" w:left="720" w:header="708" w:footer="708" w:gutter="0"/>
+      <w:pgMar w:top="540" w:right="540" w:bottom="540" w:left="540" w:header="708" w:footer="708" w:gutter="0"/>
       <w:pgNumType/>
       <w:docGrid w:linePitch="360"/>
     </w:sectPr>

</xml_diff>

<commit_message>
Fit OutSystems certificate to full last CV page
Remove the last-page heading and size the certificate image to fill
the A4 page with minimal margins.

Co-authored-by: myounusm <myounusm@users.noreply.github.com>
</commit_message>
<xml_diff>
--- a/public/Mohammed_Younus_CV.docx
+++ b/public/Mohammed_Younus_CV.docx
@@ -1653,29 +1653,13 @@
     </w:p>
     <w:p>
       <w:pPr>
-        <w:spacing w:after="120"/>
-        <w:jc w:val="center"/>
-      </w:pPr>
-      <w:r>
-        <w:rPr>
-          <w:rFonts w:ascii="Calibri" w:cs="Calibri" w:eastAsia="Calibri" w:hAnsi="Calibri"/>
-          <w:b/>
-          <w:bCs/>
-          <w:color w:val="0F4D48"/>
-          <w:sz w:val="22"/>
-          <w:szCs w:val="22"/>
-        </w:rPr>
-        <w:t xml:space="preserve">OutSystems Certifications</w:t>
-      </w:r>
-    </w:p>
-    <w:p>
-      <w:pPr>
+        <w:spacing w:after="0" w:before="0"/>
         <w:jc w:val="center"/>
       </w:pPr>
       <w:r>
         <w:drawing>
           <wp:inline distT="0" distB="0" distL="0" distR="0">
-            <wp:extent cx="4953000" cy="7038975"/>
+            <wp:extent cx="7372350" cy="10487025"/>
             <wp:effectExtent t="0" r="0" b="0" l="0"/>
             <wp:docPr id="1" name="outsystems-certifications" descr="Consolidated OutSystems certification certificate for Mohammed Younus Mohiuddin" title="OutSystems certifications"/>
             <wp:cNvGraphicFramePr>
@@ -1700,7 +1684,7 @@
                   <pic:spPr bwMode="auto">
                     <a:xfrm>
                       <a:off x="0" y="0"/>
-                      <a:ext cx="4953000" cy="7038975"/>
+                      <a:ext cx="7372350" cy="10487025"/>
                     </a:xfrm>
                     <a:prstGeom prst="rect">
                       <a:avLst/>
@@ -1715,7 +1699,7 @@
     </w:p>
     <w:sectPr>
       <w:pgSz w:w="11906" w:h="16838" w:orient="portrait"/>
-      <w:pgMar w:top="540" w:right="540" w:bottom="540" w:left="540" w:header="708" w:footer="708" w:gutter="0"/>
+      <w:pgMar w:top="144" w:right="144" w:bottom="144" w:left="144" w:header="708" w:footer="708" w:gutter="0"/>
       <w:pgNumType/>
       <w:docGrid w:linePitch="360"/>
     </w:sectPr>

</xml_diff>

<commit_message>
Replace CV certificate image with OutSystems timeline
Build an interviewer-ready certification journey page with badge icons,
dates, platforms, and progression narrative instead of the full-page image.

Co-authored-by: myounusm <myounusm@users.noreply.github.com>
</commit_message>
<xml_diff>
--- a/public/Mohammed_Younus_CV.docx
+++ b/public/Mohammed_Younus_CV.docx
@@ -1653,53 +1653,2537 @@
     </w:p>
     <w:p>
       <w:pPr>
-        <w:spacing w:after="0" w:before="0"/>
+        <w:spacing w:after="60"/>
+      </w:pPr>
+      <w:r>
+        <w:rPr>
+          <w:rFonts w:ascii="Calibri" w:cs="Calibri" w:eastAsia="Calibri" w:hAnsi="Calibri"/>
+          <w:b/>
+          <w:bCs/>
+          <w:color w:val="0F4D48"/>
+          <w:sz w:val="28"/>
+          <w:szCs w:val="28"/>
+        </w:rPr>
+        <w:t xml:space="preserve">OutSystems Certification Journey</w:t>
+      </w:r>
+    </w:p>
+    <w:p>
+      <w:pPr>
+        <w:spacing w:after="40"/>
+      </w:pPr>
+      <w:r>
+        <w:rPr>
+          <w:rFonts w:ascii="Calibri" w:cs="Calibri" w:eastAsia="Calibri" w:hAnsi="Calibri"/>
+          <w:b/>
+          <w:bCs/>
+          <w:color w:val="E4002B"/>
+          <w:sz w:val="20"/>
+          <w:szCs w:val="20"/>
+        </w:rPr>
+        <w:t xml:space="preserve">13 certifications  ·  O11 + ODC  ·  Jun 2023 → Jan 2026</w:t>
+      </w:r>
+    </w:p>
+    <w:p>
+      <w:pPr>
+        <w:spacing w:after="160"/>
+      </w:pPr>
+      <w:r>
+        <w:rPr>
+          <w:rFonts w:ascii="Calibri" w:cs="Calibri" w:eastAsia="Calibri" w:hAnsi="Calibri"/>
+          <w:color w:val="3A4D57"/>
+          <w:sz w:val="20"/>
+          <w:szCs w:val="20"/>
+        </w:rPr>
+        <w:t xml:space="preserve">Progressed from Associate Developer to Architecture Specialist and Tech Lead across OutSystems 11 and OutSystems Developer Cloud — spanning core development, mobile, security, platform operations, and architecture.</w:t>
+      </w:r>
+    </w:p>
+    <w:p>
+      <w:pPr>
+        <w:pBdr>
+          <w:bottom w:val="single" w:color="E4002B" w:sz="12" w:space="2"/>
+        </w:pBdr>
+        <w:spacing w:after="80"/>
+      </w:pPr>
+      <w:r>
+        <w:rPr>
+          <w:rFonts w:ascii="Calibri" w:cs="Calibri" w:eastAsia="Calibri" w:hAnsi="Calibri"/>
+          <w:b/>
+          <w:bCs/>
+          <w:color w:val="E4002B"/>
+          <w:sz w:val="18"/>
+          <w:szCs w:val="18"/>
+        </w:rPr>
+        <w:t xml:space="preserve">CERTIFICATION TIMELINE (MOST RECENT FIRST)</w:t>
+      </w:r>
+    </w:p>
+    <w:tbl>
+      <w:tblPr>
+        <w:tblW w:type="dxa" w:w="10500"/>
+        <w:tblBorders>
+          <w:top w:val="single" w:color="auto" w:sz="4"/>
+          <w:left w:val="single" w:color="auto" w:sz="4"/>
+          <w:bottom w:val="single" w:color="auto" w:sz="4"/>
+          <w:right w:val="single" w:color="auto" w:sz="4"/>
+          <w:insideH w:val="single" w:color="auto" w:sz="4"/>
+          <w:insideV w:val="single" w:color="auto" w:sz="4"/>
+        </w:tblBorders>
+      </w:tblPr>
+      <w:tblGrid>
+        <w:gridCol w:w="1400"/>
+        <w:gridCol w:w="700"/>
+        <w:gridCol w:w="1100"/>
+        <w:gridCol w:w="6300"/>
+      </w:tblGrid>
+      <w:tr>
+        <w:tc>
+          <w:tcPr>
+            <w:tcW w:type="dxa" w:w="1400"/>
+            <w:tcBorders>
+              <w:top w:val="none" w:color="FFFFFF" w:sz="0"/>
+              <w:left w:val="none" w:color="FFFFFF" w:sz="0"/>
+              <w:bottom w:val="none" w:color="FFFFFF" w:sz="0"/>
+              <w:right w:val="none" w:color="FFFFFF" w:sz="0"/>
+            </w:tcBorders>
+            <w:vAlign w:val="center"/>
+          </w:tcPr>
+          <w:p>
+            <w:pPr>
+              <w:spacing w:after="0" w:before="40"/>
+              <w:jc w:val="right"/>
+            </w:pPr>
+            <w:r>
+              <w:rPr>
+                <w:rFonts w:ascii="Calibri" w:cs="Calibri" w:eastAsia="Calibri" w:hAnsi="Calibri"/>
+                <w:b/>
+                <w:bCs/>
+                <w:color w:val="0F4D48"/>
+                <w:sz w:val="18"/>
+                <w:szCs w:val="18"/>
+              </w:rPr>
+              <w:t xml:space="preserve">Jan 17, 2026</w:t>
+            </w:r>
+          </w:p>
+        </w:tc>
+        <w:tc>
+          <w:tcPr>
+            <w:tcW w:type="dxa" w:w="700"/>
+            <w:tcBorders>
+              <w:top w:val="none" w:color="FFFFFF" w:sz="0"/>
+              <w:left w:val="none" w:color="FFFFFF" w:sz="0"/>
+              <w:bottom w:val="none" w:color="FFFFFF" w:sz="0"/>
+              <w:right w:val="none" w:color="FFFFFF" w:sz="0"/>
+            </w:tcBorders>
+            <w:vAlign w:val="center"/>
+          </w:tcPr>
+          <w:p>
+            <w:pPr>
+              <w:spacing w:after="0" w:before="0"/>
+              <w:jc w:val="center"/>
+            </w:pPr>
+            <w:r>
+              <w:rPr>
+                <w:rFonts w:ascii="Calibri" w:cs="Calibri" w:eastAsia="Calibri" w:hAnsi="Calibri"/>
+                <w:color w:val="E4002B"/>
+                <w:sz w:val="28"/>
+                <w:szCs w:val="28"/>
+              </w:rPr>
+              <w:t xml:space="preserve">●</w:t>
+            </w:r>
+          </w:p>
+          <w:p>
+            <w:pPr>
+              <w:spacing w:after="0" w:before="0"/>
+              <w:jc w:val="center"/>
+            </w:pPr>
+            <w:r>
+              <w:rPr>
+                <w:rFonts w:ascii="Calibri" w:cs="Calibri" w:eastAsia="Calibri" w:hAnsi="Calibri"/>
+                <w:color w:val="F2A0A8"/>
+                <w:sz w:val="22"/>
+                <w:szCs w:val="22"/>
+              </w:rPr>
+              <w:t xml:space="preserve">│</w:t>
+            </w:r>
+          </w:p>
+        </w:tc>
+        <w:tc>
+          <w:tcPr>
+            <w:tcW w:type="dxa" w:w="1100"/>
+            <w:tcBorders>
+              <w:top w:val="none" w:color="FFFFFF" w:sz="0"/>
+              <w:left w:val="none" w:color="FFFFFF" w:sz="0"/>
+              <w:bottom w:val="none" w:color="FFFFFF" w:sz="0"/>
+              <w:right w:val="none" w:color="FFFFFF" w:sz="0"/>
+            </w:tcBorders>
+            <w:vAlign w:val="center"/>
+          </w:tcPr>
+          <w:p>
+            <w:pPr>
+              <w:spacing w:after="20" w:before="20"/>
+            </w:pPr>
+            <w:r>
+              <w:drawing>
+                <wp:inline distT="0" distB="0" distL="0" distR="0">
+                  <wp:extent cx="438150" cy="476250"/>
+                  <wp:effectExtent t="0" r="0" b="0" l="0"/>
+                  <wp:docPr id="1" name="architecture.png" descr="Architecture Specialist (ODC) badge" title="Architecture Specialist (ODC)"/>
+                  <wp:cNvGraphicFramePr>
+                    <a:graphicFrameLocks xmlns:a="http://schemas.openxmlformats.org/drawingml/2006/main" noChangeAspect="1"/>
+                  </wp:cNvGraphicFramePr>
+                  <a:graphic xmlns:a="http://schemas.openxmlformats.org/drawingml/2006/main">
+                    <a:graphicData uri="http://schemas.openxmlformats.org/drawingml/2006/picture">
+                      <pic:pic xmlns:pic="http://schemas.openxmlformats.org/drawingml/2006/picture">
+                        <pic:nvPicPr>
+                          <pic:cNvPr id="0" name="" descr=""/>
+                          <pic:cNvPicPr>
+                            <a:picLocks noChangeAspect="1" noChangeArrowheads="1"/>
+                          </pic:cNvPicPr>
+                        </pic:nvPicPr>
+                        <pic:blipFill>
+                          <a:blip r:embed="rId7" cstate="none"/>
+                          <a:srcRect/>
+                          <a:stretch>
+                            <a:fillRect/>
+                          </a:stretch>
+                        </pic:blipFill>
+                        <pic:spPr bwMode="auto">
+                          <a:xfrm>
+                            <a:off x="0" y="0"/>
+                            <a:ext cx="438150" cy="476250"/>
+                          </a:xfrm>
+                          <a:prstGeom prst="rect">
+                            <a:avLst/>
+                          </a:prstGeom>
+                        </pic:spPr>
+                      </pic:pic>
+                    </a:graphicData>
+                  </a:graphic>
+                </wp:inline>
+              </w:drawing>
+            </w:r>
+          </w:p>
+        </w:tc>
+        <w:tc>
+          <w:tcPr>
+            <w:tcW w:type="dxa" w:w="6300"/>
+            <w:tcBorders>
+              <w:top w:val="none" w:color="FFFFFF" w:sz="0"/>
+              <w:left w:val="none" w:color="FFFFFF" w:sz="0"/>
+              <w:bottom w:val="single" w:color="E8EEF0" w:sz="4" w:space="1"/>
+              <w:right w:val="none" w:color="FFFFFF" w:sz="0"/>
+            </w:tcBorders>
+            <w:vAlign w:val="center"/>
+          </w:tcPr>
+          <w:p>
+            <w:pPr>
+              <w:spacing w:after="10" w:before="40"/>
+            </w:pPr>
+            <w:r>
+              <w:rPr>
+                <w:rFonts w:ascii="Calibri" w:cs="Calibri" w:eastAsia="Calibri" w:hAnsi="Calibri"/>
+                <w:b/>
+                <w:bCs/>
+                <w:color w:val="14232B"/>
+                <w:sz w:val="22"/>
+                <w:szCs w:val="22"/>
+              </w:rPr>
+              <w:t xml:space="preserve">Architecture Specialist (ODC)</w:t>
+            </w:r>
+          </w:p>
+          <w:p>
+            <w:pPr>
+              <w:spacing w:after="10" w:before="0"/>
+            </w:pPr>
+            <w:r>
+              <w:rPr>
+                <w:rFonts w:ascii="Calibri" w:cs="Calibri" w:eastAsia="Calibri" w:hAnsi="Calibri"/>
+                <w:b/>
+                <w:bCs/>
+                <w:color w:val="E4002B"/>
+                <w:sz w:val="17"/>
+                <w:szCs w:val="17"/>
+              </w:rPr>
+              <w:t xml:space="preserve">Specialist  ·  Architecture  ·  ODC</w:t>
+            </w:r>
+          </w:p>
+          <w:p>
+            <w:pPr>
+              <w:spacing w:after="50" w:before="0"/>
+            </w:pPr>
+            <w:r>
+              <w:rPr>
+                <w:rFonts w:ascii="Calibri" w:cs="Calibri" w:eastAsia="Calibri" w:hAnsi="Calibri"/>
+                <w:color w:val="3A4D57"/>
+                <w:sz w:val="18"/>
+                <w:szCs w:val="18"/>
+              </w:rPr>
+              <w:t xml:space="preserve">Cloud-native architecture design for OutSystems Developer Cloud</w:t>
+            </w:r>
+          </w:p>
+        </w:tc>
+      </w:tr>
+      <w:tr>
+        <w:tc>
+          <w:tcPr>
+            <w:tcW w:type="dxa" w:w="1400"/>
+            <w:tcBorders>
+              <w:top w:val="none" w:color="FFFFFF" w:sz="0"/>
+              <w:left w:val="none" w:color="FFFFFF" w:sz="0"/>
+              <w:bottom w:val="none" w:color="FFFFFF" w:sz="0"/>
+              <w:right w:val="none" w:color="FFFFFF" w:sz="0"/>
+            </w:tcBorders>
+            <w:vAlign w:val="center"/>
+          </w:tcPr>
+          <w:p>
+            <w:pPr>
+              <w:spacing w:after="0" w:before="40"/>
+              <w:jc w:val="right"/>
+            </w:pPr>
+            <w:r>
+              <w:rPr>
+                <w:rFonts w:ascii="Calibri" w:cs="Calibri" w:eastAsia="Calibri" w:hAnsi="Calibri"/>
+                <w:b/>
+                <w:bCs/>
+                <w:color w:val="0F4D48"/>
+                <w:sz w:val="18"/>
+                <w:szCs w:val="18"/>
+              </w:rPr>
+              <w:t xml:space="preserve">Jun 24, 2025</w:t>
+            </w:r>
+          </w:p>
+        </w:tc>
+        <w:tc>
+          <w:tcPr>
+            <w:tcW w:type="dxa" w:w="700"/>
+            <w:tcBorders>
+              <w:top w:val="none" w:color="FFFFFF" w:sz="0"/>
+              <w:left w:val="none" w:color="FFFFFF" w:sz="0"/>
+              <w:bottom w:val="none" w:color="FFFFFF" w:sz="0"/>
+              <w:right w:val="none" w:color="FFFFFF" w:sz="0"/>
+            </w:tcBorders>
+            <w:vAlign w:val="center"/>
+          </w:tcPr>
+          <w:p>
+            <w:pPr>
+              <w:spacing w:after="0" w:before="0"/>
+              <w:jc w:val="center"/>
+            </w:pPr>
+            <w:r>
+              <w:rPr>
+                <w:rFonts w:ascii="Calibri" w:cs="Calibri" w:eastAsia="Calibri" w:hAnsi="Calibri"/>
+                <w:color w:val="E4002B"/>
+                <w:sz w:val="28"/>
+                <w:szCs w:val="28"/>
+              </w:rPr>
+              <w:t xml:space="preserve">●</w:t>
+            </w:r>
+          </w:p>
+          <w:p>
+            <w:pPr>
+              <w:spacing w:after="0" w:before="0"/>
+              <w:jc w:val="center"/>
+            </w:pPr>
+            <w:r>
+              <w:rPr>
+                <w:rFonts w:ascii="Calibri" w:cs="Calibri" w:eastAsia="Calibri" w:hAnsi="Calibri"/>
+                <w:color w:val="F2A0A8"/>
+                <w:sz w:val="22"/>
+                <w:szCs w:val="22"/>
+              </w:rPr>
+              <w:t xml:space="preserve">│</w:t>
+            </w:r>
+          </w:p>
+        </w:tc>
+        <w:tc>
+          <w:tcPr>
+            <w:tcW w:type="dxa" w:w="1100"/>
+            <w:tcBorders>
+              <w:top w:val="none" w:color="FFFFFF" w:sz="0"/>
+              <w:left w:val="none" w:color="FFFFFF" w:sz="0"/>
+              <w:bottom w:val="none" w:color="FFFFFF" w:sz="0"/>
+              <w:right w:val="none" w:color="FFFFFF" w:sz="0"/>
+            </w:tcBorders>
+            <w:vAlign w:val="center"/>
+          </w:tcPr>
+          <w:p>
+            <w:pPr>
+              <w:spacing w:after="20" w:before="20"/>
+            </w:pPr>
+            <w:r>
+              <w:drawing>
+                <wp:inline distT="0" distB="0" distL="0" distR="0">
+                  <wp:extent cx="438150" cy="476250"/>
+                  <wp:effectExtent t="0" r="0" b="0" l="0"/>
+                  <wp:docPr id="1" name="platform-ops.png" descr="Platform Ops (O11) badge" title="Platform Ops (O11)"/>
+                  <wp:cNvGraphicFramePr>
+                    <a:graphicFrameLocks xmlns:a="http://schemas.openxmlformats.org/drawingml/2006/main" noChangeAspect="1"/>
+                  </wp:cNvGraphicFramePr>
+                  <a:graphic xmlns:a="http://schemas.openxmlformats.org/drawingml/2006/main">
+                    <a:graphicData uri="http://schemas.openxmlformats.org/drawingml/2006/picture">
+                      <pic:pic xmlns:pic="http://schemas.openxmlformats.org/drawingml/2006/picture">
+                        <pic:nvPicPr>
+                          <pic:cNvPr id="0" name="" descr=""/>
+                          <pic:cNvPicPr>
+                            <a:picLocks noChangeAspect="1" noChangeArrowheads="1"/>
+                          </pic:cNvPicPr>
+                        </pic:nvPicPr>
+                        <pic:blipFill>
+                          <a:blip r:embed="rId8" cstate="none"/>
+                          <a:srcRect/>
+                          <a:stretch>
+                            <a:fillRect/>
+                          </a:stretch>
+                        </pic:blipFill>
+                        <pic:spPr bwMode="auto">
+                          <a:xfrm>
+                            <a:off x="0" y="0"/>
+                            <a:ext cx="438150" cy="476250"/>
+                          </a:xfrm>
+                          <a:prstGeom prst="rect">
+                            <a:avLst/>
+                          </a:prstGeom>
+                        </pic:spPr>
+                      </pic:pic>
+                    </a:graphicData>
+                  </a:graphic>
+                </wp:inline>
+              </w:drawing>
+            </w:r>
+          </w:p>
+        </w:tc>
+        <w:tc>
+          <w:tcPr>
+            <w:tcW w:type="dxa" w:w="6300"/>
+            <w:tcBorders>
+              <w:top w:val="none" w:color="FFFFFF" w:sz="0"/>
+              <w:left w:val="none" w:color="FFFFFF" w:sz="0"/>
+              <w:bottom w:val="single" w:color="E8EEF0" w:sz="4" w:space="1"/>
+              <w:right w:val="none" w:color="FFFFFF" w:sz="0"/>
+            </w:tcBorders>
+            <w:vAlign w:val="center"/>
+          </w:tcPr>
+          <w:p>
+            <w:pPr>
+              <w:spacing w:after="10" w:before="40"/>
+            </w:pPr>
+            <w:r>
+              <w:rPr>
+                <w:rFonts w:ascii="Calibri" w:cs="Calibri" w:eastAsia="Calibri" w:hAnsi="Calibri"/>
+                <w:b/>
+                <w:bCs/>
+                <w:color w:val="14232B"/>
+                <w:sz w:val="22"/>
+                <w:szCs w:val="22"/>
+              </w:rPr>
+              <w:t xml:space="preserve">Platform Ops (O11)</w:t>
+            </w:r>
+          </w:p>
+          <w:p>
+            <w:pPr>
+              <w:spacing w:after="10" w:before="0"/>
+            </w:pPr>
+            <w:r>
+              <w:rPr>
+                <w:rFonts w:ascii="Calibri" w:cs="Calibri" w:eastAsia="Calibri" w:hAnsi="Calibri"/>
+                <w:b/>
+                <w:bCs/>
+                <w:color w:val="E4002B"/>
+                <w:sz w:val="17"/>
+                <w:szCs w:val="17"/>
+              </w:rPr>
+              <w:t xml:space="preserve">Ops  ·  Platform Operations  ·  O11</w:t>
+            </w:r>
+          </w:p>
+          <w:p>
+            <w:pPr>
+              <w:spacing w:after="50" w:before="0"/>
+            </w:pPr>
+            <w:r>
+              <w:rPr>
+                <w:rFonts w:ascii="Calibri" w:cs="Calibri" w:eastAsia="Calibri" w:hAnsi="Calibri"/>
+                <w:color w:val="3A4D57"/>
+                <w:sz w:val="18"/>
+                <w:szCs w:val="18"/>
+              </w:rPr>
+              <w:t xml:space="preserve">LifeTime governance, environments, releases, and platform reliability</w:t>
+            </w:r>
+          </w:p>
+        </w:tc>
+      </w:tr>
+      <w:tr>
+        <w:tc>
+          <w:tcPr>
+            <w:tcW w:type="dxa" w:w="1400"/>
+            <w:tcBorders>
+              <w:top w:val="none" w:color="FFFFFF" w:sz="0"/>
+              <w:left w:val="none" w:color="FFFFFF" w:sz="0"/>
+              <w:bottom w:val="none" w:color="FFFFFF" w:sz="0"/>
+              <w:right w:val="none" w:color="FFFFFF" w:sz="0"/>
+            </w:tcBorders>
+            <w:vAlign w:val="center"/>
+          </w:tcPr>
+          <w:p>
+            <w:pPr>
+              <w:spacing w:after="0" w:before="40"/>
+              <w:jc w:val="right"/>
+            </w:pPr>
+            <w:r>
+              <w:rPr>
+                <w:rFonts w:ascii="Calibri" w:cs="Calibri" w:eastAsia="Calibri" w:hAnsi="Calibri"/>
+                <w:b/>
+                <w:bCs/>
+                <w:color w:val="0F4D48"/>
+                <w:sz w:val="18"/>
+                <w:szCs w:val="18"/>
+              </w:rPr>
+              <w:t xml:space="preserve">Jun 18, 2025</w:t>
+            </w:r>
+          </w:p>
+        </w:tc>
+        <w:tc>
+          <w:tcPr>
+            <w:tcW w:type="dxa" w:w="700"/>
+            <w:tcBorders>
+              <w:top w:val="none" w:color="FFFFFF" w:sz="0"/>
+              <w:left w:val="none" w:color="FFFFFF" w:sz="0"/>
+              <w:bottom w:val="none" w:color="FFFFFF" w:sz="0"/>
+              <w:right w:val="none" w:color="FFFFFF" w:sz="0"/>
+            </w:tcBorders>
+            <w:vAlign w:val="center"/>
+          </w:tcPr>
+          <w:p>
+            <w:pPr>
+              <w:spacing w:after="0" w:before="0"/>
+              <w:jc w:val="center"/>
+            </w:pPr>
+            <w:r>
+              <w:rPr>
+                <w:rFonts w:ascii="Calibri" w:cs="Calibri" w:eastAsia="Calibri" w:hAnsi="Calibri"/>
+                <w:color w:val="E4002B"/>
+                <w:sz w:val="28"/>
+                <w:szCs w:val="28"/>
+              </w:rPr>
+              <w:t xml:space="preserve">●</w:t>
+            </w:r>
+          </w:p>
+          <w:p>
+            <w:pPr>
+              <w:spacing w:after="0" w:before="0"/>
+              <w:jc w:val="center"/>
+            </w:pPr>
+            <w:r>
+              <w:rPr>
+                <w:rFonts w:ascii="Calibri" w:cs="Calibri" w:eastAsia="Calibri" w:hAnsi="Calibri"/>
+                <w:color w:val="F2A0A8"/>
+                <w:sz w:val="22"/>
+                <w:szCs w:val="22"/>
+              </w:rPr>
+              <w:t xml:space="preserve">│</w:t>
+            </w:r>
+          </w:p>
+        </w:tc>
+        <w:tc>
+          <w:tcPr>
+            <w:tcW w:type="dxa" w:w="1100"/>
+            <w:tcBorders>
+              <w:top w:val="none" w:color="FFFFFF" w:sz="0"/>
+              <w:left w:val="none" w:color="FFFFFF" w:sz="0"/>
+              <w:bottom w:val="none" w:color="FFFFFF" w:sz="0"/>
+              <w:right w:val="none" w:color="FFFFFF" w:sz="0"/>
+            </w:tcBorders>
+            <w:vAlign w:val="center"/>
+          </w:tcPr>
+          <w:p>
+            <w:pPr>
+              <w:spacing w:after="20" w:before="20"/>
+            </w:pPr>
+            <w:r>
+              <w:drawing>
+                <wp:inline distT="0" distB="0" distL="0" distR="0">
+                  <wp:extent cx="438150" cy="476250"/>
+                  <wp:effectExtent t="0" r="0" b="0" l="0"/>
+                  <wp:docPr id="1" name="tech-lead.png" descr="Tech Lead (O11) badge" title="Tech Lead (O11)"/>
+                  <wp:cNvGraphicFramePr>
+                    <a:graphicFrameLocks xmlns:a="http://schemas.openxmlformats.org/drawingml/2006/main" noChangeAspect="1"/>
+                  </wp:cNvGraphicFramePr>
+                  <a:graphic xmlns:a="http://schemas.openxmlformats.org/drawingml/2006/main">
+                    <a:graphicData uri="http://schemas.openxmlformats.org/drawingml/2006/picture">
+                      <pic:pic xmlns:pic="http://schemas.openxmlformats.org/drawingml/2006/picture">
+                        <pic:nvPicPr>
+                          <pic:cNvPr id="0" name="" descr=""/>
+                          <pic:cNvPicPr>
+                            <a:picLocks noChangeAspect="1" noChangeArrowheads="1"/>
+                          </pic:cNvPicPr>
+                        </pic:nvPicPr>
+                        <pic:blipFill>
+                          <a:blip r:embed="rId9" cstate="none"/>
+                          <a:srcRect/>
+                          <a:stretch>
+                            <a:fillRect/>
+                          </a:stretch>
+                        </pic:blipFill>
+                        <pic:spPr bwMode="auto">
+                          <a:xfrm>
+                            <a:off x="0" y="0"/>
+                            <a:ext cx="438150" cy="476250"/>
+                          </a:xfrm>
+                          <a:prstGeom prst="rect">
+                            <a:avLst/>
+                          </a:prstGeom>
+                        </pic:spPr>
+                      </pic:pic>
+                    </a:graphicData>
+                  </a:graphic>
+                </wp:inline>
+              </w:drawing>
+            </w:r>
+          </w:p>
+        </w:tc>
+        <w:tc>
+          <w:tcPr>
+            <w:tcW w:type="dxa" w:w="6300"/>
+            <w:tcBorders>
+              <w:top w:val="none" w:color="FFFFFF" w:sz="0"/>
+              <w:left w:val="none" w:color="FFFFFF" w:sz="0"/>
+              <w:bottom w:val="single" w:color="E8EEF0" w:sz="4" w:space="1"/>
+              <w:right w:val="none" w:color="FFFFFF" w:sz="0"/>
+            </w:tcBorders>
+            <w:vAlign w:val="center"/>
+          </w:tcPr>
+          <w:p>
+            <w:pPr>
+              <w:spacing w:after="10" w:before="40"/>
+            </w:pPr>
+            <w:r>
+              <w:rPr>
+                <w:rFonts w:ascii="Calibri" w:cs="Calibri" w:eastAsia="Calibri" w:hAnsi="Calibri"/>
+                <w:b/>
+                <w:bCs/>
+                <w:color w:val="14232B"/>
+                <w:sz w:val="22"/>
+                <w:szCs w:val="22"/>
+              </w:rPr>
+              <w:t xml:space="preserve">Tech Lead (O11)</w:t>
+            </w:r>
+          </w:p>
+          <w:p>
+            <w:pPr>
+              <w:spacing w:after="10" w:before="0"/>
+            </w:pPr>
+            <w:r>
+              <w:rPr>
+                <w:rFonts w:ascii="Calibri" w:cs="Calibri" w:eastAsia="Calibri" w:hAnsi="Calibri"/>
+                <w:b/>
+                <w:bCs/>
+                <w:color w:val="E4002B"/>
+                <w:sz w:val="17"/>
+                <w:szCs w:val="17"/>
+              </w:rPr>
+              <w:t xml:space="preserve">Tech Lead  ·  Leadership  ·  O11</w:t>
+            </w:r>
+          </w:p>
+          <w:p>
+            <w:pPr>
+              <w:spacing w:after="50" w:before="0"/>
+            </w:pPr>
+            <w:r>
+              <w:rPr>
+                <w:rFonts w:ascii="Calibri" w:cs="Calibri" w:eastAsia="Calibri" w:hAnsi="Calibri"/>
+                <w:color w:val="3A4D57"/>
+                <w:sz w:val="18"/>
+                <w:szCs w:val="18"/>
+              </w:rPr>
+              <w:t xml:space="preserve">Technical leadership, standards, mentoring, and delivery ownership</w:t>
+            </w:r>
+          </w:p>
+        </w:tc>
+      </w:tr>
+      <w:tr>
+        <w:tc>
+          <w:tcPr>
+            <w:tcW w:type="dxa" w:w="1400"/>
+            <w:tcBorders>
+              <w:top w:val="none" w:color="FFFFFF" w:sz="0"/>
+              <w:left w:val="none" w:color="FFFFFF" w:sz="0"/>
+              <w:bottom w:val="none" w:color="FFFFFF" w:sz="0"/>
+              <w:right w:val="none" w:color="FFFFFF" w:sz="0"/>
+            </w:tcBorders>
+            <w:vAlign w:val="center"/>
+          </w:tcPr>
+          <w:p>
+            <w:pPr>
+              <w:spacing w:after="0" w:before="40"/>
+              <w:jc w:val="right"/>
+            </w:pPr>
+            <w:r>
+              <w:rPr>
+                <w:rFonts w:ascii="Calibri" w:cs="Calibri" w:eastAsia="Calibri" w:hAnsi="Calibri"/>
+                <w:b/>
+                <w:bCs/>
+                <w:color w:val="0F4D48"/>
+                <w:sz w:val="18"/>
+                <w:szCs w:val="18"/>
+              </w:rPr>
+              <w:t xml:space="preserve">Dec 28, 2024</w:t>
+            </w:r>
+          </w:p>
+        </w:tc>
+        <w:tc>
+          <w:tcPr>
+            <w:tcW w:type="dxa" w:w="700"/>
+            <w:tcBorders>
+              <w:top w:val="none" w:color="FFFFFF" w:sz="0"/>
+              <w:left w:val="none" w:color="FFFFFF" w:sz="0"/>
+              <w:bottom w:val="none" w:color="FFFFFF" w:sz="0"/>
+              <w:right w:val="none" w:color="FFFFFF" w:sz="0"/>
+            </w:tcBorders>
+            <w:vAlign w:val="center"/>
+          </w:tcPr>
+          <w:p>
+            <w:pPr>
+              <w:spacing w:after="0" w:before="0"/>
+              <w:jc w:val="center"/>
+            </w:pPr>
+            <w:r>
+              <w:rPr>
+                <w:rFonts w:ascii="Calibri" w:cs="Calibri" w:eastAsia="Calibri" w:hAnsi="Calibri"/>
+                <w:color w:val="E4002B"/>
+                <w:sz w:val="28"/>
+                <w:szCs w:val="28"/>
+              </w:rPr>
+              <w:t xml:space="preserve">●</w:t>
+            </w:r>
+          </w:p>
+          <w:p>
+            <w:pPr>
+              <w:spacing w:after="0" w:before="0"/>
+              <w:jc w:val="center"/>
+            </w:pPr>
+            <w:r>
+              <w:rPr>
+                <w:rFonts w:ascii="Calibri" w:cs="Calibri" w:eastAsia="Calibri" w:hAnsi="Calibri"/>
+                <w:color w:val="F2A0A8"/>
+                <w:sz w:val="22"/>
+                <w:szCs w:val="22"/>
+              </w:rPr>
+              <w:t xml:space="preserve">│</w:t>
+            </w:r>
+          </w:p>
+        </w:tc>
+        <w:tc>
+          <w:tcPr>
+            <w:tcW w:type="dxa" w:w="1100"/>
+            <w:tcBorders>
+              <w:top w:val="none" w:color="FFFFFF" w:sz="0"/>
+              <w:left w:val="none" w:color="FFFFFF" w:sz="0"/>
+              <w:bottom w:val="none" w:color="FFFFFF" w:sz="0"/>
+              <w:right w:val="none" w:color="FFFFFF" w:sz="0"/>
+            </w:tcBorders>
+            <w:vAlign w:val="center"/>
+          </w:tcPr>
+          <w:p>
+            <w:pPr>
+              <w:spacing w:after="20" w:before="20"/>
+            </w:pPr>
+            <w:r>
+              <w:drawing>
+                <wp:inline distT="0" distB="0" distL="0" distR="0">
+                  <wp:extent cx="438150" cy="476250"/>
+                  <wp:effectExtent t="0" r="0" b="0" l="0"/>
+                  <wp:docPr id="1" name="web-specialist.png" descr="Web Developer Specialist (ODC) badge" title="Web Developer Specialist (ODC)"/>
+                  <wp:cNvGraphicFramePr>
+                    <a:graphicFrameLocks xmlns:a="http://schemas.openxmlformats.org/drawingml/2006/main" noChangeAspect="1"/>
+                  </wp:cNvGraphicFramePr>
+                  <a:graphic xmlns:a="http://schemas.openxmlformats.org/drawingml/2006/main">
+                    <a:graphicData uri="http://schemas.openxmlformats.org/drawingml/2006/picture">
+                      <pic:pic xmlns:pic="http://schemas.openxmlformats.org/drawingml/2006/picture">
+                        <pic:nvPicPr>
+                          <pic:cNvPr id="0" name="" descr=""/>
+                          <pic:cNvPicPr>
+                            <a:picLocks noChangeAspect="1" noChangeArrowheads="1"/>
+                          </pic:cNvPicPr>
+                        </pic:nvPicPr>
+                        <pic:blipFill>
+                          <a:blip r:embed="rId10" cstate="none"/>
+                          <a:srcRect/>
+                          <a:stretch>
+                            <a:fillRect/>
+                          </a:stretch>
+                        </pic:blipFill>
+                        <pic:spPr bwMode="auto">
+                          <a:xfrm>
+                            <a:off x="0" y="0"/>
+                            <a:ext cx="438150" cy="476250"/>
+                          </a:xfrm>
+                          <a:prstGeom prst="rect">
+                            <a:avLst/>
+                          </a:prstGeom>
+                        </pic:spPr>
+                      </pic:pic>
+                    </a:graphicData>
+                  </a:graphic>
+                </wp:inline>
+              </w:drawing>
+            </w:r>
+          </w:p>
+        </w:tc>
+        <w:tc>
+          <w:tcPr>
+            <w:tcW w:type="dxa" w:w="6300"/>
+            <w:tcBorders>
+              <w:top w:val="none" w:color="FFFFFF" w:sz="0"/>
+              <w:left w:val="none" w:color="FFFFFF" w:sz="0"/>
+              <w:bottom w:val="single" w:color="E8EEF0" w:sz="4" w:space="1"/>
+              <w:right w:val="none" w:color="FFFFFF" w:sz="0"/>
+            </w:tcBorders>
+            <w:vAlign w:val="center"/>
+          </w:tcPr>
+          <w:p>
+            <w:pPr>
+              <w:spacing w:after="10" w:before="40"/>
+            </w:pPr>
+            <w:r>
+              <w:rPr>
+                <w:rFonts w:ascii="Calibri" w:cs="Calibri" w:eastAsia="Calibri" w:hAnsi="Calibri"/>
+                <w:b/>
+                <w:bCs/>
+                <w:color w:val="14232B"/>
+                <w:sz w:val="22"/>
+                <w:szCs w:val="22"/>
+              </w:rPr>
+              <w:t xml:space="preserve">Web Developer Specialist (ODC)</w:t>
+            </w:r>
+          </w:p>
+          <w:p>
+            <w:pPr>
+              <w:spacing w:after="10" w:before="0"/>
+            </w:pPr>
+            <w:r>
+              <w:rPr>
+                <w:rFonts w:ascii="Calibri" w:cs="Calibri" w:eastAsia="Calibri" w:hAnsi="Calibri"/>
+                <w:b/>
+                <w:bCs/>
+                <w:color w:val="E4002B"/>
+                <w:sz w:val="17"/>
+                <w:szCs w:val="17"/>
+              </w:rPr>
+              <w:t xml:space="preserve">Specialist  ·  Web Development  ·  ODC</w:t>
+            </w:r>
+          </w:p>
+          <w:p>
+            <w:pPr>
+              <w:spacing w:after="50" w:before="0"/>
+            </w:pPr>
+            <w:r>
+              <w:rPr>
+                <w:rFonts w:ascii="Calibri" w:cs="Calibri" w:eastAsia="Calibri" w:hAnsi="Calibri"/>
+                <w:color w:val="3A4D57"/>
+                <w:sz w:val="18"/>
+                <w:szCs w:val="18"/>
+              </w:rPr>
+              <w:t xml:space="preserve">Advanced ODC web application patterns and specialist-level delivery</w:t>
+            </w:r>
+          </w:p>
+        </w:tc>
+      </w:tr>
+      <w:tr>
+        <w:tc>
+          <w:tcPr>
+            <w:tcW w:type="dxa" w:w="1400"/>
+            <w:tcBorders>
+              <w:top w:val="none" w:color="FFFFFF" w:sz="0"/>
+              <w:left w:val="none" w:color="FFFFFF" w:sz="0"/>
+              <w:bottom w:val="none" w:color="FFFFFF" w:sz="0"/>
+              <w:right w:val="none" w:color="FFFFFF" w:sz="0"/>
+            </w:tcBorders>
+            <w:vAlign w:val="center"/>
+          </w:tcPr>
+          <w:p>
+            <w:pPr>
+              <w:spacing w:after="0" w:before="40"/>
+              <w:jc w:val="right"/>
+            </w:pPr>
+            <w:r>
+              <w:rPr>
+                <w:rFonts w:ascii="Calibri" w:cs="Calibri" w:eastAsia="Calibri" w:hAnsi="Calibri"/>
+                <w:b/>
+                <w:bCs/>
+                <w:color w:val="0F4D48"/>
+                <w:sz w:val="18"/>
+                <w:szCs w:val="18"/>
+              </w:rPr>
+              <w:t xml:space="preserve">Jun 27, 2024</w:t>
+            </w:r>
+          </w:p>
+        </w:tc>
+        <w:tc>
+          <w:tcPr>
+            <w:tcW w:type="dxa" w:w="700"/>
+            <w:tcBorders>
+              <w:top w:val="none" w:color="FFFFFF" w:sz="0"/>
+              <w:left w:val="none" w:color="FFFFFF" w:sz="0"/>
+              <w:bottom w:val="none" w:color="FFFFFF" w:sz="0"/>
+              <w:right w:val="none" w:color="FFFFFF" w:sz="0"/>
+            </w:tcBorders>
+            <w:vAlign w:val="center"/>
+          </w:tcPr>
+          <w:p>
+            <w:pPr>
+              <w:spacing w:after="0" w:before="0"/>
+              <w:jc w:val="center"/>
+            </w:pPr>
+            <w:r>
+              <w:rPr>
+                <w:rFonts w:ascii="Calibri" w:cs="Calibri" w:eastAsia="Calibri" w:hAnsi="Calibri"/>
+                <w:color w:val="E4002B"/>
+                <w:sz w:val="28"/>
+                <w:szCs w:val="28"/>
+              </w:rPr>
+              <w:t xml:space="preserve">●</w:t>
+            </w:r>
+          </w:p>
+          <w:p>
+            <w:pPr>
+              <w:spacing w:after="0" w:before="0"/>
+              <w:jc w:val="center"/>
+            </w:pPr>
+            <w:r>
+              <w:rPr>
+                <w:rFonts w:ascii="Calibri" w:cs="Calibri" w:eastAsia="Calibri" w:hAnsi="Calibri"/>
+                <w:color w:val="F2A0A8"/>
+                <w:sz w:val="22"/>
+                <w:szCs w:val="22"/>
+              </w:rPr>
+              <w:t xml:space="preserve">│</w:t>
+            </w:r>
+          </w:p>
+        </w:tc>
+        <w:tc>
+          <w:tcPr>
+            <w:tcW w:type="dxa" w:w="1100"/>
+            <w:tcBorders>
+              <w:top w:val="none" w:color="FFFFFF" w:sz="0"/>
+              <w:left w:val="none" w:color="FFFFFF" w:sz="0"/>
+              <w:bottom w:val="none" w:color="FFFFFF" w:sz="0"/>
+              <w:right w:val="none" w:color="FFFFFF" w:sz="0"/>
+            </w:tcBorders>
+            <w:vAlign w:val="center"/>
+          </w:tcPr>
+          <w:p>
+            <w:pPr>
+              <w:spacing w:after="20" w:before="20"/>
+            </w:pPr>
+            <w:r>
+              <w:drawing>
+                <wp:inline distT="0" distB="0" distL="0" distR="0">
+                  <wp:extent cx="438150" cy="476250"/>
+                  <wp:effectExtent t="0" r="0" b="0" l="0"/>
+                  <wp:docPr id="1" name="associate-traditional.png" descr="Associate Traditional Web Developer (O11) badge" title="Associate Traditional Web Developer (O11)"/>
+                  <wp:cNvGraphicFramePr>
+                    <a:graphicFrameLocks xmlns:a="http://schemas.openxmlformats.org/drawingml/2006/main" noChangeAspect="1"/>
+                  </wp:cNvGraphicFramePr>
+                  <a:graphic xmlns:a="http://schemas.openxmlformats.org/drawingml/2006/main">
+                    <a:graphicData uri="http://schemas.openxmlformats.org/drawingml/2006/picture">
+                      <pic:pic xmlns:pic="http://schemas.openxmlformats.org/drawingml/2006/picture">
+                        <pic:nvPicPr>
+                          <pic:cNvPr id="0" name="" descr=""/>
+                          <pic:cNvPicPr>
+                            <a:picLocks noChangeAspect="1" noChangeArrowheads="1"/>
+                          </pic:cNvPicPr>
+                        </pic:nvPicPr>
+                        <pic:blipFill>
+                          <a:blip r:embed="rId11" cstate="none"/>
+                          <a:srcRect/>
+                          <a:stretch>
+                            <a:fillRect/>
+                          </a:stretch>
+                        </pic:blipFill>
+                        <pic:spPr bwMode="auto">
+                          <a:xfrm>
+                            <a:off x="0" y="0"/>
+                            <a:ext cx="438150" cy="476250"/>
+                          </a:xfrm>
+                          <a:prstGeom prst="rect">
+                            <a:avLst/>
+                          </a:prstGeom>
+                        </pic:spPr>
+                      </pic:pic>
+                    </a:graphicData>
+                  </a:graphic>
+                </wp:inline>
+              </w:drawing>
+            </w:r>
+          </w:p>
+        </w:tc>
+        <w:tc>
+          <w:tcPr>
+            <w:tcW w:type="dxa" w:w="6300"/>
+            <w:tcBorders>
+              <w:top w:val="none" w:color="FFFFFF" w:sz="0"/>
+              <w:left w:val="none" w:color="FFFFFF" w:sz="0"/>
+              <w:bottom w:val="single" w:color="E8EEF0" w:sz="4" w:space="1"/>
+              <w:right w:val="none" w:color="FFFFFF" w:sz="0"/>
+            </w:tcBorders>
+            <w:vAlign w:val="center"/>
+          </w:tcPr>
+          <w:p>
+            <w:pPr>
+              <w:spacing w:after="10" w:before="40"/>
+            </w:pPr>
+            <w:r>
+              <w:rPr>
+                <w:rFonts w:ascii="Calibri" w:cs="Calibri" w:eastAsia="Calibri" w:hAnsi="Calibri"/>
+                <w:b/>
+                <w:bCs/>
+                <w:color w:val="14232B"/>
+                <w:sz w:val="22"/>
+                <w:szCs w:val="22"/>
+              </w:rPr>
+              <w:t xml:space="preserve">Associate Traditional Web Developer (O11)</w:t>
+            </w:r>
+          </w:p>
+          <w:p>
+            <w:pPr>
+              <w:spacing w:after="10" w:before="0"/>
+            </w:pPr>
+            <w:r>
+              <w:rPr>
+                <w:rFonts w:ascii="Calibri" w:cs="Calibri" w:eastAsia="Calibri" w:hAnsi="Calibri"/>
+                <w:b/>
+                <w:bCs/>
+                <w:color w:val="E4002B"/>
+                <w:sz w:val="17"/>
+                <w:szCs w:val="17"/>
+              </w:rPr>
+              <w:t xml:space="preserve">Associate  ·  Traditional Web  ·  O11</w:t>
+            </w:r>
+          </w:p>
+          <w:p>
+            <w:pPr>
+              <w:spacing w:after="50" w:before="0"/>
+            </w:pPr>
+            <w:r>
+              <w:rPr>
+                <w:rFonts w:ascii="Calibri" w:cs="Calibri" w:eastAsia="Calibri" w:hAnsi="Calibri"/>
+                <w:color w:val="3A4D57"/>
+                <w:sz w:val="18"/>
+                <w:szCs w:val="18"/>
+              </w:rPr>
+              <w:t xml:space="preserve">Traditional Web skills complementing Reactive/ODC delivery</w:t>
+            </w:r>
+          </w:p>
+        </w:tc>
+      </w:tr>
+      <w:tr>
+        <w:tc>
+          <w:tcPr>
+            <w:tcW w:type="dxa" w:w="1400"/>
+            <w:tcBorders>
+              <w:top w:val="none" w:color="FFFFFF" w:sz="0"/>
+              <w:left w:val="none" w:color="FFFFFF" w:sz="0"/>
+              <w:bottom w:val="none" w:color="FFFFFF" w:sz="0"/>
+              <w:right w:val="none" w:color="FFFFFF" w:sz="0"/>
+            </w:tcBorders>
+            <w:vAlign w:val="center"/>
+          </w:tcPr>
+          <w:p>
+            <w:pPr>
+              <w:spacing w:after="0" w:before="40"/>
+              <w:jc w:val="right"/>
+            </w:pPr>
+            <w:r>
+              <w:rPr>
+                <w:rFonts w:ascii="Calibri" w:cs="Calibri" w:eastAsia="Calibri" w:hAnsi="Calibri"/>
+                <w:b/>
+                <w:bCs/>
+                <w:color w:val="0F4D48"/>
+                <w:sz w:val="18"/>
+                <w:szCs w:val="18"/>
+              </w:rPr>
+              <w:t xml:space="preserve">Nov 03, 2023</w:t>
+            </w:r>
+          </w:p>
+        </w:tc>
+        <w:tc>
+          <w:tcPr>
+            <w:tcW w:type="dxa" w:w="700"/>
+            <w:tcBorders>
+              <w:top w:val="none" w:color="FFFFFF" w:sz="0"/>
+              <w:left w:val="none" w:color="FFFFFF" w:sz="0"/>
+              <w:bottom w:val="none" w:color="FFFFFF" w:sz="0"/>
+              <w:right w:val="none" w:color="FFFFFF" w:sz="0"/>
+            </w:tcBorders>
+            <w:vAlign w:val="center"/>
+          </w:tcPr>
+          <w:p>
+            <w:pPr>
+              <w:spacing w:after="0" w:before="0"/>
+              <w:jc w:val="center"/>
+            </w:pPr>
+            <w:r>
+              <w:rPr>
+                <w:rFonts w:ascii="Calibri" w:cs="Calibri" w:eastAsia="Calibri" w:hAnsi="Calibri"/>
+                <w:color w:val="E4002B"/>
+                <w:sz w:val="28"/>
+                <w:szCs w:val="28"/>
+              </w:rPr>
+              <w:t xml:space="preserve">●</w:t>
+            </w:r>
+          </w:p>
+          <w:p>
+            <w:pPr>
+              <w:spacing w:after="0" w:before="0"/>
+              <w:jc w:val="center"/>
+            </w:pPr>
+            <w:r>
+              <w:rPr>
+                <w:rFonts w:ascii="Calibri" w:cs="Calibri" w:eastAsia="Calibri" w:hAnsi="Calibri"/>
+                <w:color w:val="F2A0A8"/>
+                <w:sz w:val="22"/>
+                <w:szCs w:val="22"/>
+              </w:rPr>
+              <w:t xml:space="preserve">│</w:t>
+            </w:r>
+          </w:p>
+        </w:tc>
+        <w:tc>
+          <w:tcPr>
+            <w:tcW w:type="dxa" w:w="1100"/>
+            <w:tcBorders>
+              <w:top w:val="none" w:color="FFFFFF" w:sz="0"/>
+              <w:left w:val="none" w:color="FFFFFF" w:sz="0"/>
+              <w:bottom w:val="none" w:color="FFFFFF" w:sz="0"/>
+              <w:right w:val="none" w:color="FFFFFF" w:sz="0"/>
+            </w:tcBorders>
+            <w:vAlign w:val="center"/>
+          </w:tcPr>
+          <w:p>
+            <w:pPr>
+              <w:spacing w:after="20" w:before="20"/>
+            </w:pPr>
+            <w:r>
+              <w:drawing>
+                <wp:inline distT="0" distB="0" distL="0" distR="0">
+                  <wp:extent cx="438150" cy="476250"/>
+                  <wp:effectExtent t="0" r="0" b="0" l="0"/>
+                  <wp:docPr id="1" name="architecture.png" descr="Architecture Specialist (O11) badge" title="Architecture Specialist (O11)"/>
+                  <wp:cNvGraphicFramePr>
+                    <a:graphicFrameLocks xmlns:a="http://schemas.openxmlformats.org/drawingml/2006/main" noChangeAspect="1"/>
+                  </wp:cNvGraphicFramePr>
+                  <a:graphic xmlns:a="http://schemas.openxmlformats.org/drawingml/2006/main">
+                    <a:graphicData uri="http://schemas.openxmlformats.org/drawingml/2006/picture">
+                      <pic:pic xmlns:pic="http://schemas.openxmlformats.org/drawingml/2006/picture">
+                        <pic:nvPicPr>
+                          <pic:cNvPr id="0" name="" descr=""/>
+                          <pic:cNvPicPr>
+                            <a:picLocks noChangeAspect="1" noChangeArrowheads="1"/>
+                          </pic:cNvPicPr>
+                        </pic:nvPicPr>
+                        <pic:blipFill>
+                          <a:blip r:embed="rId7" cstate="none"/>
+                          <a:srcRect/>
+                          <a:stretch>
+                            <a:fillRect/>
+                          </a:stretch>
+                        </pic:blipFill>
+                        <pic:spPr bwMode="auto">
+                          <a:xfrm>
+                            <a:off x="0" y="0"/>
+                            <a:ext cx="438150" cy="476250"/>
+                          </a:xfrm>
+                          <a:prstGeom prst="rect">
+                            <a:avLst/>
+                          </a:prstGeom>
+                        </pic:spPr>
+                      </pic:pic>
+                    </a:graphicData>
+                  </a:graphic>
+                </wp:inline>
+              </w:drawing>
+            </w:r>
+          </w:p>
+        </w:tc>
+        <w:tc>
+          <w:tcPr>
+            <w:tcW w:type="dxa" w:w="6300"/>
+            <w:tcBorders>
+              <w:top w:val="none" w:color="FFFFFF" w:sz="0"/>
+              <w:left w:val="none" w:color="FFFFFF" w:sz="0"/>
+              <w:bottom w:val="single" w:color="E8EEF0" w:sz="4" w:space="1"/>
+              <w:right w:val="none" w:color="FFFFFF" w:sz="0"/>
+            </w:tcBorders>
+            <w:vAlign w:val="center"/>
+          </w:tcPr>
+          <w:p>
+            <w:pPr>
+              <w:spacing w:after="10" w:before="40"/>
+            </w:pPr>
+            <w:r>
+              <w:rPr>
+                <w:rFonts w:ascii="Calibri" w:cs="Calibri" w:eastAsia="Calibri" w:hAnsi="Calibri"/>
+                <w:b/>
+                <w:bCs/>
+                <w:color w:val="14232B"/>
+                <w:sz w:val="22"/>
+                <w:szCs w:val="22"/>
+              </w:rPr>
+              <w:t xml:space="preserve">Architecture Specialist (O11)</w:t>
+            </w:r>
+          </w:p>
+          <w:p>
+            <w:pPr>
+              <w:spacing w:after="10" w:before="0"/>
+            </w:pPr>
+            <w:r>
+              <w:rPr>
+                <w:rFonts w:ascii="Calibri" w:cs="Calibri" w:eastAsia="Calibri" w:hAnsi="Calibri"/>
+                <w:b/>
+                <w:bCs/>
+                <w:color w:val="E4002B"/>
+                <w:sz w:val="17"/>
+                <w:szCs w:val="17"/>
+              </w:rPr>
+              <w:t xml:space="preserve">Specialist  ·  Architecture  ·  O11</w:t>
+            </w:r>
+          </w:p>
+          <w:p>
+            <w:pPr>
+              <w:spacing w:after="50" w:before="0"/>
+            </w:pPr>
+            <w:r>
+              <w:rPr>
+                <w:rFonts w:ascii="Calibri" w:cs="Calibri" w:eastAsia="Calibri" w:hAnsi="Calibri"/>
+                <w:color w:val="3A4D57"/>
+                <w:sz w:val="18"/>
+                <w:szCs w:val="18"/>
+              </w:rPr>
+              <w:t xml:space="preserve">Enterprise architecture, module design, and long-term maintainability</w:t>
+            </w:r>
+          </w:p>
+        </w:tc>
+      </w:tr>
+      <w:tr>
+        <w:tc>
+          <w:tcPr>
+            <w:tcW w:type="dxa" w:w="1400"/>
+            <w:tcBorders>
+              <w:top w:val="none" w:color="FFFFFF" w:sz="0"/>
+              <w:left w:val="none" w:color="FFFFFF" w:sz="0"/>
+              <w:bottom w:val="none" w:color="FFFFFF" w:sz="0"/>
+              <w:right w:val="none" w:color="FFFFFF" w:sz="0"/>
+            </w:tcBorders>
+            <w:vAlign w:val="center"/>
+          </w:tcPr>
+          <w:p>
+            <w:pPr>
+              <w:spacing w:after="0" w:before="40"/>
+              <w:jc w:val="right"/>
+            </w:pPr>
+            <w:r>
+              <w:rPr>
+                <w:rFonts w:ascii="Calibri" w:cs="Calibri" w:eastAsia="Calibri" w:hAnsi="Calibri"/>
+                <w:b/>
+                <w:bCs/>
+                <w:color w:val="0F4D48"/>
+                <w:sz w:val="18"/>
+                <w:szCs w:val="18"/>
+              </w:rPr>
+              <w:t xml:space="preserve">Nov 03, 2023</w:t>
+            </w:r>
+          </w:p>
+        </w:tc>
+        <w:tc>
+          <w:tcPr>
+            <w:tcW w:type="dxa" w:w="700"/>
+            <w:tcBorders>
+              <w:top w:val="none" w:color="FFFFFF" w:sz="0"/>
+              <w:left w:val="none" w:color="FFFFFF" w:sz="0"/>
+              <w:bottom w:val="none" w:color="FFFFFF" w:sz="0"/>
+              <w:right w:val="none" w:color="FFFFFF" w:sz="0"/>
+            </w:tcBorders>
+            <w:vAlign w:val="center"/>
+          </w:tcPr>
+          <w:p>
+            <w:pPr>
+              <w:spacing w:after="0" w:before="0"/>
+              <w:jc w:val="center"/>
+            </w:pPr>
+            <w:r>
+              <w:rPr>
+                <w:rFonts w:ascii="Calibri" w:cs="Calibri" w:eastAsia="Calibri" w:hAnsi="Calibri"/>
+                <w:color w:val="E4002B"/>
+                <w:sz w:val="28"/>
+                <w:szCs w:val="28"/>
+              </w:rPr>
+              <w:t xml:space="preserve">●</w:t>
+            </w:r>
+          </w:p>
+          <w:p>
+            <w:pPr>
+              <w:spacing w:after="0" w:before="0"/>
+              <w:jc w:val="center"/>
+            </w:pPr>
+            <w:r>
+              <w:rPr>
+                <w:rFonts w:ascii="Calibri" w:cs="Calibri" w:eastAsia="Calibri" w:hAnsi="Calibri"/>
+                <w:color w:val="F2A0A8"/>
+                <w:sz w:val="22"/>
+                <w:szCs w:val="22"/>
+              </w:rPr>
+              <w:t xml:space="preserve">│</w:t>
+            </w:r>
+          </w:p>
+        </w:tc>
+        <w:tc>
+          <w:tcPr>
+            <w:tcW w:type="dxa" w:w="1100"/>
+            <w:tcBorders>
+              <w:top w:val="none" w:color="FFFFFF" w:sz="0"/>
+              <w:left w:val="none" w:color="FFFFFF" w:sz="0"/>
+              <w:bottom w:val="none" w:color="FFFFFF" w:sz="0"/>
+              <w:right w:val="none" w:color="FFFFFF" w:sz="0"/>
+            </w:tcBorders>
+            <w:vAlign w:val="center"/>
+          </w:tcPr>
+          <w:p>
+            <w:pPr>
+              <w:spacing w:after="20" w:before="20"/>
+            </w:pPr>
+            <w:r>
+              <w:drawing>
+                <wp:inline distT="0" distB="0" distL="0" distR="0">
+                  <wp:extent cx="438150" cy="476250"/>
+                  <wp:effectExtent t="0" r="0" b="0" l="0"/>
+                  <wp:docPr id="1" name="professional-web.png" descr="Professional Web Developer (O11) badge" title="Professional Web Developer (O11)"/>
+                  <wp:cNvGraphicFramePr>
+                    <a:graphicFrameLocks xmlns:a="http://schemas.openxmlformats.org/drawingml/2006/main" noChangeAspect="1"/>
+                  </wp:cNvGraphicFramePr>
+                  <a:graphic xmlns:a="http://schemas.openxmlformats.org/drawingml/2006/main">
+                    <a:graphicData uri="http://schemas.openxmlformats.org/drawingml/2006/picture">
+                      <pic:pic xmlns:pic="http://schemas.openxmlformats.org/drawingml/2006/picture">
+                        <pic:nvPicPr>
+                          <pic:cNvPr id="0" name="" descr=""/>
+                          <pic:cNvPicPr>
+                            <a:picLocks noChangeAspect="1" noChangeArrowheads="1"/>
+                          </pic:cNvPicPr>
+                        </pic:nvPicPr>
+                        <pic:blipFill>
+                          <a:blip r:embed="rId12" cstate="none"/>
+                          <a:srcRect/>
+                          <a:stretch>
+                            <a:fillRect/>
+                          </a:stretch>
+                        </pic:blipFill>
+                        <pic:spPr bwMode="auto">
+                          <a:xfrm>
+                            <a:off x="0" y="0"/>
+                            <a:ext cx="438150" cy="476250"/>
+                          </a:xfrm>
+                          <a:prstGeom prst="rect">
+                            <a:avLst/>
+                          </a:prstGeom>
+                        </pic:spPr>
+                      </pic:pic>
+                    </a:graphicData>
+                  </a:graphic>
+                </wp:inline>
+              </w:drawing>
+            </w:r>
+          </w:p>
+        </w:tc>
+        <w:tc>
+          <w:tcPr>
+            <w:tcW w:type="dxa" w:w="6300"/>
+            <w:tcBorders>
+              <w:top w:val="none" w:color="FFFFFF" w:sz="0"/>
+              <w:left w:val="none" w:color="FFFFFF" w:sz="0"/>
+              <w:bottom w:val="single" w:color="E8EEF0" w:sz="4" w:space="1"/>
+              <w:right w:val="none" w:color="FFFFFF" w:sz="0"/>
+            </w:tcBorders>
+            <w:vAlign w:val="center"/>
+          </w:tcPr>
+          <w:p>
+            <w:pPr>
+              <w:spacing w:after="10" w:before="40"/>
+            </w:pPr>
+            <w:r>
+              <w:rPr>
+                <w:rFonts w:ascii="Calibri" w:cs="Calibri" w:eastAsia="Calibri" w:hAnsi="Calibri"/>
+                <w:b/>
+                <w:bCs/>
+                <w:color w:val="14232B"/>
+                <w:sz w:val="22"/>
+                <w:szCs w:val="22"/>
+              </w:rPr>
+              <w:t xml:space="preserve">Professional Web Developer (O11)</w:t>
+            </w:r>
+          </w:p>
+          <w:p>
+            <w:pPr>
+              <w:spacing w:after="10" w:before="0"/>
+            </w:pPr>
+            <w:r>
+              <w:rPr>
+                <w:rFonts w:ascii="Calibri" w:cs="Calibri" w:eastAsia="Calibri" w:hAnsi="Calibri"/>
+                <w:b/>
+                <w:bCs/>
+                <w:color w:val="E4002B"/>
+                <w:sz w:val="17"/>
+                <w:szCs w:val="17"/>
+              </w:rPr>
+              <w:t xml:space="preserve">Professional  ·  Web Development  ·  O11</w:t>
+            </w:r>
+          </w:p>
+          <w:p>
+            <w:pPr>
+              <w:spacing w:after="50" w:before="0"/>
+            </w:pPr>
+            <w:r>
+              <w:rPr>
+                <w:rFonts w:ascii="Calibri" w:cs="Calibri" w:eastAsia="Calibri" w:hAnsi="Calibri"/>
+                <w:color w:val="3A4D57"/>
+                <w:sz w:val="18"/>
+                <w:szCs w:val="18"/>
+              </w:rPr>
+              <w:t xml:space="preserve">Professional-grade Reactive/Web application development</w:t>
+            </w:r>
+          </w:p>
+        </w:tc>
+      </w:tr>
+      <w:tr>
+        <w:tc>
+          <w:tcPr>
+            <w:tcW w:type="dxa" w:w="1400"/>
+            <w:tcBorders>
+              <w:top w:val="none" w:color="FFFFFF" w:sz="0"/>
+              <w:left w:val="none" w:color="FFFFFF" w:sz="0"/>
+              <w:bottom w:val="none" w:color="FFFFFF" w:sz="0"/>
+              <w:right w:val="none" w:color="FFFFFF" w:sz="0"/>
+            </w:tcBorders>
+            <w:vAlign w:val="center"/>
+          </w:tcPr>
+          <w:p>
+            <w:pPr>
+              <w:spacing w:after="0" w:before="40"/>
+              <w:jc w:val="right"/>
+            </w:pPr>
+            <w:r>
+              <w:rPr>
+                <w:rFonts w:ascii="Calibri" w:cs="Calibri" w:eastAsia="Calibri" w:hAnsi="Calibri"/>
+                <w:b/>
+                <w:bCs/>
+                <w:color w:val="0F4D48"/>
+                <w:sz w:val="18"/>
+                <w:szCs w:val="18"/>
+              </w:rPr>
+              <w:t xml:space="preserve">Nov 03, 2023</w:t>
+            </w:r>
+          </w:p>
+        </w:tc>
+        <w:tc>
+          <w:tcPr>
+            <w:tcW w:type="dxa" w:w="700"/>
+            <w:tcBorders>
+              <w:top w:val="none" w:color="FFFFFF" w:sz="0"/>
+              <w:left w:val="none" w:color="FFFFFF" w:sz="0"/>
+              <w:bottom w:val="none" w:color="FFFFFF" w:sz="0"/>
+              <w:right w:val="none" w:color="FFFFFF" w:sz="0"/>
+            </w:tcBorders>
+            <w:vAlign w:val="center"/>
+          </w:tcPr>
+          <w:p>
+            <w:pPr>
+              <w:spacing w:after="0" w:before="0"/>
+              <w:jc w:val="center"/>
+            </w:pPr>
+            <w:r>
+              <w:rPr>
+                <w:rFonts w:ascii="Calibri" w:cs="Calibri" w:eastAsia="Calibri" w:hAnsi="Calibri"/>
+                <w:color w:val="E4002B"/>
+                <w:sz w:val="28"/>
+                <w:szCs w:val="28"/>
+              </w:rPr>
+              <w:t xml:space="preserve">●</w:t>
+            </w:r>
+          </w:p>
+          <w:p>
+            <w:pPr>
+              <w:spacing w:after="0" w:before="0"/>
+              <w:jc w:val="center"/>
+            </w:pPr>
+            <w:r>
+              <w:rPr>
+                <w:rFonts w:ascii="Calibri" w:cs="Calibri" w:eastAsia="Calibri" w:hAnsi="Calibri"/>
+                <w:color w:val="F2A0A8"/>
+                <w:sz w:val="22"/>
+                <w:szCs w:val="22"/>
+              </w:rPr>
+              <w:t xml:space="preserve">│</w:t>
+            </w:r>
+          </w:p>
+        </w:tc>
+        <w:tc>
+          <w:tcPr>
+            <w:tcW w:type="dxa" w:w="1100"/>
+            <w:tcBorders>
+              <w:top w:val="none" w:color="FFFFFF" w:sz="0"/>
+              <w:left w:val="none" w:color="FFFFFF" w:sz="0"/>
+              <w:bottom w:val="none" w:color="FFFFFF" w:sz="0"/>
+              <w:right w:val="none" w:color="FFFFFF" w:sz="0"/>
+            </w:tcBorders>
+            <w:vAlign w:val="center"/>
+          </w:tcPr>
+          <w:p>
+            <w:pPr>
+              <w:spacing w:after="20" w:before="20"/>
+            </w:pPr>
+            <w:r>
+              <w:drawing>
+                <wp:inline distT="0" distB="0" distL="0" distR="0">
+                  <wp:extent cx="438150" cy="476250"/>
+                  <wp:effectExtent t="0" r="0" b="0" l="0"/>
+                  <wp:docPr id="1" name="professional-mobile.png" descr="Professional Mobile Developer (O11) badge" title="Professional Mobile Developer (O11)"/>
+                  <wp:cNvGraphicFramePr>
+                    <a:graphicFrameLocks xmlns:a="http://schemas.openxmlformats.org/drawingml/2006/main" noChangeAspect="1"/>
+                  </wp:cNvGraphicFramePr>
+                  <a:graphic xmlns:a="http://schemas.openxmlformats.org/drawingml/2006/main">
+                    <a:graphicData uri="http://schemas.openxmlformats.org/drawingml/2006/picture">
+                      <pic:pic xmlns:pic="http://schemas.openxmlformats.org/drawingml/2006/picture">
+                        <pic:nvPicPr>
+                          <pic:cNvPr id="0" name="" descr=""/>
+                          <pic:cNvPicPr>
+                            <a:picLocks noChangeAspect="1" noChangeArrowheads="1"/>
+                          </pic:cNvPicPr>
+                        </pic:nvPicPr>
+                        <pic:blipFill>
+                          <a:blip r:embed="rId13" cstate="none"/>
+                          <a:srcRect/>
+                          <a:stretch>
+                            <a:fillRect/>
+                          </a:stretch>
+                        </pic:blipFill>
+                        <pic:spPr bwMode="auto">
+                          <a:xfrm>
+                            <a:off x="0" y="0"/>
+                            <a:ext cx="438150" cy="476250"/>
+                          </a:xfrm>
+                          <a:prstGeom prst="rect">
+                            <a:avLst/>
+                          </a:prstGeom>
+                        </pic:spPr>
+                      </pic:pic>
+                    </a:graphicData>
+                  </a:graphic>
+                </wp:inline>
+              </w:drawing>
+            </w:r>
+          </w:p>
+        </w:tc>
+        <w:tc>
+          <w:tcPr>
+            <w:tcW w:type="dxa" w:w="6300"/>
+            <w:tcBorders>
+              <w:top w:val="none" w:color="FFFFFF" w:sz="0"/>
+              <w:left w:val="none" w:color="FFFFFF" w:sz="0"/>
+              <w:bottom w:val="single" w:color="E8EEF0" w:sz="4" w:space="1"/>
+              <w:right w:val="none" w:color="FFFFFF" w:sz="0"/>
+            </w:tcBorders>
+            <w:vAlign w:val="center"/>
+          </w:tcPr>
+          <w:p>
+            <w:pPr>
+              <w:spacing w:after="10" w:before="40"/>
+            </w:pPr>
+            <w:r>
+              <w:rPr>
+                <w:rFonts w:ascii="Calibri" w:cs="Calibri" w:eastAsia="Calibri" w:hAnsi="Calibri"/>
+                <w:b/>
+                <w:bCs/>
+                <w:color w:val="14232B"/>
+                <w:sz w:val="22"/>
+                <w:szCs w:val="22"/>
+              </w:rPr>
+              <w:t xml:space="preserve">Professional Mobile Developer (O11)</w:t>
+            </w:r>
+          </w:p>
+          <w:p>
+            <w:pPr>
+              <w:spacing w:after="10" w:before="0"/>
+            </w:pPr>
+            <w:r>
+              <w:rPr>
+                <w:rFonts w:ascii="Calibri" w:cs="Calibri" w:eastAsia="Calibri" w:hAnsi="Calibri"/>
+                <w:b/>
+                <w:bCs/>
+                <w:color w:val="E4002B"/>
+                <w:sz w:val="17"/>
+                <w:szCs w:val="17"/>
+              </w:rPr>
+              <w:t xml:space="preserve">Professional  ·  Mobile Development  ·  O11</w:t>
+            </w:r>
+          </w:p>
+          <w:p>
+            <w:pPr>
+              <w:spacing w:after="50" w:before="0"/>
+            </w:pPr>
+            <w:r>
+              <w:rPr>
+                <w:rFonts w:ascii="Calibri" w:cs="Calibri" w:eastAsia="Calibri" w:hAnsi="Calibri"/>
+                <w:color w:val="3A4D57"/>
+                <w:sz w:val="18"/>
+                <w:szCs w:val="18"/>
+              </w:rPr>
+              <w:t xml:space="preserve">Mobile delivery with professional OutSystems mobile patterns</w:t>
+            </w:r>
+          </w:p>
+        </w:tc>
+      </w:tr>
+      <w:tr>
+        <w:tc>
+          <w:tcPr>
+            <w:tcW w:type="dxa" w:w="1400"/>
+            <w:tcBorders>
+              <w:top w:val="none" w:color="FFFFFF" w:sz="0"/>
+              <w:left w:val="none" w:color="FFFFFF" w:sz="0"/>
+              <w:bottom w:val="none" w:color="FFFFFF" w:sz="0"/>
+              <w:right w:val="none" w:color="FFFFFF" w:sz="0"/>
+            </w:tcBorders>
+            <w:vAlign w:val="center"/>
+          </w:tcPr>
+          <w:p>
+            <w:pPr>
+              <w:spacing w:after="0" w:before="40"/>
+              <w:jc w:val="right"/>
+            </w:pPr>
+            <w:r>
+              <w:rPr>
+                <w:rFonts w:ascii="Calibri" w:cs="Calibri" w:eastAsia="Calibri" w:hAnsi="Calibri"/>
+                <w:b/>
+                <w:bCs/>
+                <w:color w:val="0F4D48"/>
+                <w:sz w:val="18"/>
+                <w:szCs w:val="18"/>
+              </w:rPr>
+              <w:t xml:space="preserve">Sep 13, 2023</w:t>
+            </w:r>
+          </w:p>
+        </w:tc>
+        <w:tc>
+          <w:tcPr>
+            <w:tcW w:type="dxa" w:w="700"/>
+            <w:tcBorders>
+              <w:top w:val="none" w:color="FFFFFF" w:sz="0"/>
+              <w:left w:val="none" w:color="FFFFFF" w:sz="0"/>
+              <w:bottom w:val="none" w:color="FFFFFF" w:sz="0"/>
+              <w:right w:val="none" w:color="FFFFFF" w:sz="0"/>
+            </w:tcBorders>
+            <w:vAlign w:val="center"/>
+          </w:tcPr>
+          <w:p>
+            <w:pPr>
+              <w:spacing w:after="0" w:before="0"/>
+              <w:jc w:val="center"/>
+            </w:pPr>
+            <w:r>
+              <w:rPr>
+                <w:rFonts w:ascii="Calibri" w:cs="Calibri" w:eastAsia="Calibri" w:hAnsi="Calibri"/>
+                <w:color w:val="E4002B"/>
+                <w:sz w:val="28"/>
+                <w:szCs w:val="28"/>
+              </w:rPr>
+              <w:t xml:space="preserve">●</w:t>
+            </w:r>
+          </w:p>
+          <w:p>
+            <w:pPr>
+              <w:spacing w:after="0" w:before="0"/>
+              <w:jc w:val="center"/>
+            </w:pPr>
+            <w:r>
+              <w:rPr>
+                <w:rFonts w:ascii="Calibri" w:cs="Calibri" w:eastAsia="Calibri" w:hAnsi="Calibri"/>
+                <w:color w:val="F2A0A8"/>
+                <w:sz w:val="22"/>
+                <w:szCs w:val="22"/>
+              </w:rPr>
+              <w:t xml:space="preserve">│</w:t>
+            </w:r>
+          </w:p>
+        </w:tc>
+        <w:tc>
+          <w:tcPr>
+            <w:tcW w:type="dxa" w:w="1100"/>
+            <w:tcBorders>
+              <w:top w:val="none" w:color="FFFFFF" w:sz="0"/>
+              <w:left w:val="none" w:color="FFFFFF" w:sz="0"/>
+              <w:bottom w:val="none" w:color="FFFFFF" w:sz="0"/>
+              <w:right w:val="none" w:color="FFFFFF" w:sz="0"/>
+            </w:tcBorders>
+            <w:vAlign w:val="center"/>
+          </w:tcPr>
+          <w:p>
+            <w:pPr>
+              <w:spacing w:after="20" w:before="20"/>
+            </w:pPr>
+            <w:r>
+              <w:drawing>
+                <wp:inline distT="0" distB="0" distL="0" distR="0">
+                  <wp:extent cx="438150" cy="476250"/>
+                  <wp:effectExtent t="0" r="0" b="0" l="0"/>
+                  <wp:docPr id="1" name="security-specialist.png" descr="Security Specialist (O11 and ODC) badge" title="Security Specialist (O11 and ODC)"/>
+                  <wp:cNvGraphicFramePr>
+                    <a:graphicFrameLocks xmlns:a="http://schemas.openxmlformats.org/drawingml/2006/main" noChangeAspect="1"/>
+                  </wp:cNvGraphicFramePr>
+                  <a:graphic xmlns:a="http://schemas.openxmlformats.org/drawingml/2006/main">
+                    <a:graphicData uri="http://schemas.openxmlformats.org/drawingml/2006/picture">
+                      <pic:pic xmlns:pic="http://schemas.openxmlformats.org/drawingml/2006/picture">
+                        <pic:nvPicPr>
+                          <pic:cNvPr id="0" name="" descr=""/>
+                          <pic:cNvPicPr>
+                            <a:picLocks noChangeAspect="1" noChangeArrowheads="1"/>
+                          </pic:cNvPicPr>
+                        </pic:nvPicPr>
+                        <pic:blipFill>
+                          <a:blip r:embed="rId14" cstate="none"/>
+                          <a:srcRect/>
+                          <a:stretch>
+                            <a:fillRect/>
+                          </a:stretch>
+                        </pic:blipFill>
+                        <pic:spPr bwMode="auto">
+                          <a:xfrm>
+                            <a:off x="0" y="0"/>
+                            <a:ext cx="438150" cy="476250"/>
+                          </a:xfrm>
+                          <a:prstGeom prst="rect">
+                            <a:avLst/>
+                          </a:prstGeom>
+                        </pic:spPr>
+                      </pic:pic>
+                    </a:graphicData>
+                  </a:graphic>
+                </wp:inline>
+              </w:drawing>
+            </w:r>
+          </w:p>
+        </w:tc>
+        <w:tc>
+          <w:tcPr>
+            <w:tcW w:type="dxa" w:w="6300"/>
+            <w:tcBorders>
+              <w:top w:val="none" w:color="FFFFFF" w:sz="0"/>
+              <w:left w:val="none" w:color="FFFFFF" w:sz="0"/>
+              <w:bottom w:val="single" w:color="E8EEF0" w:sz="4" w:space="1"/>
+              <w:right w:val="none" w:color="FFFFFF" w:sz="0"/>
+            </w:tcBorders>
+            <w:vAlign w:val="center"/>
+          </w:tcPr>
+          <w:p>
+            <w:pPr>
+              <w:spacing w:after="10" w:before="40"/>
+            </w:pPr>
+            <w:r>
+              <w:rPr>
+                <w:rFonts w:ascii="Calibri" w:cs="Calibri" w:eastAsia="Calibri" w:hAnsi="Calibri"/>
+                <w:b/>
+                <w:bCs/>
+                <w:color w:val="14232B"/>
+                <w:sz w:val="22"/>
+                <w:szCs w:val="22"/>
+              </w:rPr>
+              <w:t xml:space="preserve">Security Specialist (O11 and ODC)</w:t>
+            </w:r>
+          </w:p>
+          <w:p>
+            <w:pPr>
+              <w:spacing w:after="10" w:before="0"/>
+            </w:pPr>
+            <w:r>
+              <w:rPr>
+                <w:rFonts w:ascii="Calibri" w:cs="Calibri" w:eastAsia="Calibri" w:hAnsi="Calibri"/>
+                <w:b/>
+                <w:bCs/>
+                <w:color w:val="E4002B"/>
+                <w:sz w:val="17"/>
+                <w:szCs w:val="17"/>
+              </w:rPr>
+              <w:t xml:space="preserve">Specialist  ·  Security  ·  O11 &amp; ODC</w:t>
+            </w:r>
+          </w:p>
+          <w:p>
+            <w:pPr>
+              <w:spacing w:after="50" w:before="0"/>
+            </w:pPr>
+            <w:r>
+              <w:rPr>
+                <w:rFonts w:ascii="Calibri" w:cs="Calibri" w:eastAsia="Calibri" w:hAnsi="Calibri"/>
+                <w:color w:val="3A4D57"/>
+                <w:sz w:val="18"/>
+                <w:szCs w:val="18"/>
+              </w:rPr>
+              <w:t xml:space="preserve">Secure design, authentication, and platform security best practices</w:t>
+            </w:r>
+          </w:p>
+        </w:tc>
+      </w:tr>
+      <w:tr>
+        <w:tc>
+          <w:tcPr>
+            <w:tcW w:type="dxa" w:w="1400"/>
+            <w:tcBorders>
+              <w:top w:val="none" w:color="FFFFFF" w:sz="0"/>
+              <w:left w:val="none" w:color="FFFFFF" w:sz="0"/>
+              <w:bottom w:val="none" w:color="FFFFFF" w:sz="0"/>
+              <w:right w:val="none" w:color="FFFFFF" w:sz="0"/>
+            </w:tcBorders>
+            <w:vAlign w:val="center"/>
+          </w:tcPr>
+          <w:p>
+            <w:pPr>
+              <w:spacing w:after="0" w:before="40"/>
+              <w:jc w:val="right"/>
+            </w:pPr>
+            <w:r>
+              <w:rPr>
+                <w:rFonts w:ascii="Calibri" w:cs="Calibri" w:eastAsia="Calibri" w:hAnsi="Calibri"/>
+                <w:b/>
+                <w:bCs/>
+                <w:color w:val="0F4D48"/>
+                <w:sz w:val="18"/>
+                <w:szCs w:val="18"/>
+              </w:rPr>
+              <w:t xml:space="preserve">Aug 25, 2023</w:t>
+            </w:r>
+          </w:p>
+        </w:tc>
+        <w:tc>
+          <w:tcPr>
+            <w:tcW w:type="dxa" w:w="700"/>
+            <w:tcBorders>
+              <w:top w:val="none" w:color="FFFFFF" w:sz="0"/>
+              <w:left w:val="none" w:color="FFFFFF" w:sz="0"/>
+              <w:bottom w:val="none" w:color="FFFFFF" w:sz="0"/>
+              <w:right w:val="none" w:color="FFFFFF" w:sz="0"/>
+            </w:tcBorders>
+            <w:vAlign w:val="center"/>
+          </w:tcPr>
+          <w:p>
+            <w:pPr>
+              <w:spacing w:after="0" w:before="0"/>
+              <w:jc w:val="center"/>
+            </w:pPr>
+            <w:r>
+              <w:rPr>
+                <w:rFonts w:ascii="Calibri" w:cs="Calibri" w:eastAsia="Calibri" w:hAnsi="Calibri"/>
+                <w:color w:val="E4002B"/>
+                <w:sz w:val="28"/>
+                <w:szCs w:val="28"/>
+              </w:rPr>
+              <w:t xml:space="preserve">●</w:t>
+            </w:r>
+          </w:p>
+          <w:p>
+            <w:pPr>
+              <w:spacing w:after="0" w:before="0"/>
+              <w:jc w:val="center"/>
+            </w:pPr>
+            <w:r>
+              <w:rPr>
+                <w:rFonts w:ascii="Calibri" w:cs="Calibri" w:eastAsia="Calibri" w:hAnsi="Calibri"/>
+                <w:color w:val="F2A0A8"/>
+                <w:sz w:val="22"/>
+                <w:szCs w:val="22"/>
+              </w:rPr>
+              <w:t xml:space="preserve">│</w:t>
+            </w:r>
+          </w:p>
+        </w:tc>
+        <w:tc>
+          <w:tcPr>
+            <w:tcW w:type="dxa" w:w="1100"/>
+            <w:tcBorders>
+              <w:top w:val="none" w:color="FFFFFF" w:sz="0"/>
+              <w:left w:val="none" w:color="FFFFFF" w:sz="0"/>
+              <w:bottom w:val="none" w:color="FFFFFF" w:sz="0"/>
+              <w:right w:val="none" w:color="FFFFFF" w:sz="0"/>
+            </w:tcBorders>
+            <w:vAlign w:val="center"/>
+          </w:tcPr>
+          <w:p>
+            <w:pPr>
+              <w:spacing w:after="20" w:before="20"/>
+            </w:pPr>
+            <w:r>
+              <w:drawing>
+                <wp:inline distT="0" distB="0" distL="0" distR="0">
+                  <wp:extent cx="438150" cy="476250"/>
+                  <wp:effectExtent t="0" r="0" b="0" l="0"/>
+                  <wp:docPr id="1" name="web-specialist.png" descr="Web Developer Specialist (O11) badge" title="Web Developer Specialist (O11)"/>
+                  <wp:cNvGraphicFramePr>
+                    <a:graphicFrameLocks xmlns:a="http://schemas.openxmlformats.org/drawingml/2006/main" noChangeAspect="1"/>
+                  </wp:cNvGraphicFramePr>
+                  <a:graphic xmlns:a="http://schemas.openxmlformats.org/drawingml/2006/main">
+                    <a:graphicData uri="http://schemas.openxmlformats.org/drawingml/2006/picture">
+                      <pic:pic xmlns:pic="http://schemas.openxmlformats.org/drawingml/2006/picture">
+                        <pic:nvPicPr>
+                          <pic:cNvPr id="0" name="" descr=""/>
+                          <pic:cNvPicPr>
+                            <a:picLocks noChangeAspect="1" noChangeArrowheads="1"/>
+                          </pic:cNvPicPr>
+                        </pic:nvPicPr>
+                        <pic:blipFill>
+                          <a:blip r:embed="rId10" cstate="none"/>
+                          <a:srcRect/>
+                          <a:stretch>
+                            <a:fillRect/>
+                          </a:stretch>
+                        </pic:blipFill>
+                        <pic:spPr bwMode="auto">
+                          <a:xfrm>
+                            <a:off x="0" y="0"/>
+                            <a:ext cx="438150" cy="476250"/>
+                          </a:xfrm>
+                          <a:prstGeom prst="rect">
+                            <a:avLst/>
+                          </a:prstGeom>
+                        </pic:spPr>
+                      </pic:pic>
+                    </a:graphicData>
+                  </a:graphic>
+                </wp:inline>
+              </w:drawing>
+            </w:r>
+          </w:p>
+        </w:tc>
+        <w:tc>
+          <w:tcPr>
+            <w:tcW w:type="dxa" w:w="6300"/>
+            <w:tcBorders>
+              <w:top w:val="none" w:color="FFFFFF" w:sz="0"/>
+              <w:left w:val="none" w:color="FFFFFF" w:sz="0"/>
+              <w:bottom w:val="single" w:color="E8EEF0" w:sz="4" w:space="1"/>
+              <w:right w:val="none" w:color="FFFFFF" w:sz="0"/>
+            </w:tcBorders>
+            <w:vAlign w:val="center"/>
+          </w:tcPr>
+          <w:p>
+            <w:pPr>
+              <w:spacing w:after="10" w:before="40"/>
+            </w:pPr>
+            <w:r>
+              <w:rPr>
+                <w:rFonts w:ascii="Calibri" w:cs="Calibri" w:eastAsia="Calibri" w:hAnsi="Calibri"/>
+                <w:b/>
+                <w:bCs/>
+                <w:color w:val="14232B"/>
+                <w:sz w:val="22"/>
+                <w:szCs w:val="22"/>
+              </w:rPr>
+              <w:t xml:space="preserve">Web Developer Specialist (O11)</w:t>
+            </w:r>
+          </w:p>
+          <w:p>
+            <w:pPr>
+              <w:spacing w:after="10" w:before="0"/>
+            </w:pPr>
+            <w:r>
+              <w:rPr>
+                <w:rFonts w:ascii="Calibri" w:cs="Calibri" w:eastAsia="Calibri" w:hAnsi="Calibri"/>
+                <w:b/>
+                <w:bCs/>
+                <w:color w:val="E4002B"/>
+                <w:sz w:val="17"/>
+                <w:szCs w:val="17"/>
+              </w:rPr>
+              <w:t xml:space="preserve">Specialist  ·  Web Development  ·  O11</w:t>
+            </w:r>
+          </w:p>
+          <w:p>
+            <w:pPr>
+              <w:spacing w:after="50" w:before="0"/>
+            </w:pPr>
+            <w:r>
+              <w:rPr>
+                <w:rFonts w:ascii="Calibri" w:cs="Calibri" w:eastAsia="Calibri" w:hAnsi="Calibri"/>
+                <w:color w:val="3A4D57"/>
+                <w:sz w:val="18"/>
+                <w:szCs w:val="18"/>
+              </w:rPr>
+              <w:t xml:space="preserve">Specialist web patterns beyond professional developer baseline</w:t>
+            </w:r>
+          </w:p>
+        </w:tc>
+      </w:tr>
+      <w:tr>
+        <w:tc>
+          <w:tcPr>
+            <w:tcW w:type="dxa" w:w="1400"/>
+            <w:tcBorders>
+              <w:top w:val="none" w:color="FFFFFF" w:sz="0"/>
+              <w:left w:val="none" w:color="FFFFFF" w:sz="0"/>
+              <w:bottom w:val="none" w:color="FFFFFF" w:sz="0"/>
+              <w:right w:val="none" w:color="FFFFFF" w:sz="0"/>
+            </w:tcBorders>
+            <w:vAlign w:val="center"/>
+          </w:tcPr>
+          <w:p>
+            <w:pPr>
+              <w:spacing w:after="0" w:before="40"/>
+              <w:jc w:val="right"/>
+            </w:pPr>
+            <w:r>
+              <w:rPr>
+                <w:rFonts w:ascii="Calibri" w:cs="Calibri" w:eastAsia="Calibri" w:hAnsi="Calibri"/>
+                <w:b/>
+                <w:bCs/>
+                <w:color w:val="0F4D48"/>
+                <w:sz w:val="18"/>
+                <w:szCs w:val="18"/>
+              </w:rPr>
+              <w:t xml:space="preserve">Jul 24, 2023</w:t>
+            </w:r>
+          </w:p>
+        </w:tc>
+        <w:tc>
+          <w:tcPr>
+            <w:tcW w:type="dxa" w:w="700"/>
+            <w:tcBorders>
+              <w:top w:val="none" w:color="FFFFFF" w:sz="0"/>
+              <w:left w:val="none" w:color="FFFFFF" w:sz="0"/>
+              <w:bottom w:val="none" w:color="FFFFFF" w:sz="0"/>
+              <w:right w:val="none" w:color="FFFFFF" w:sz="0"/>
+            </w:tcBorders>
+            <w:vAlign w:val="center"/>
+          </w:tcPr>
+          <w:p>
+            <w:pPr>
+              <w:spacing w:after="0" w:before="0"/>
+              <w:jc w:val="center"/>
+            </w:pPr>
+            <w:r>
+              <w:rPr>
+                <w:rFonts w:ascii="Calibri" w:cs="Calibri" w:eastAsia="Calibri" w:hAnsi="Calibri"/>
+                <w:color w:val="E4002B"/>
+                <w:sz w:val="28"/>
+                <w:szCs w:val="28"/>
+              </w:rPr>
+              <w:t xml:space="preserve">●</w:t>
+            </w:r>
+          </w:p>
+          <w:p>
+            <w:pPr>
+              <w:spacing w:after="0" w:before="0"/>
+              <w:jc w:val="center"/>
+            </w:pPr>
+            <w:r>
+              <w:rPr>
+                <w:rFonts w:ascii="Calibri" w:cs="Calibri" w:eastAsia="Calibri" w:hAnsi="Calibri"/>
+                <w:color w:val="F2A0A8"/>
+                <w:sz w:val="22"/>
+                <w:szCs w:val="22"/>
+              </w:rPr>
+              <w:t xml:space="preserve">│</w:t>
+            </w:r>
+          </w:p>
+        </w:tc>
+        <w:tc>
+          <w:tcPr>
+            <w:tcW w:type="dxa" w:w="1100"/>
+            <w:tcBorders>
+              <w:top w:val="none" w:color="FFFFFF" w:sz="0"/>
+              <w:left w:val="none" w:color="FFFFFF" w:sz="0"/>
+              <w:bottom w:val="none" w:color="FFFFFF" w:sz="0"/>
+              <w:right w:val="none" w:color="FFFFFF" w:sz="0"/>
+            </w:tcBorders>
+            <w:vAlign w:val="center"/>
+          </w:tcPr>
+          <w:p>
+            <w:pPr>
+              <w:spacing w:after="20" w:before="20"/>
+            </w:pPr>
+            <w:r>
+              <w:drawing>
+                <wp:inline distT="0" distB="0" distL="0" distR="0">
+                  <wp:extent cx="438150" cy="476250"/>
+                  <wp:effectExtent t="0" r="0" b="0" l="0"/>
+                  <wp:docPr id="1" name="associate.png" descr="Associate Developer (ODC) badge" title="Associate Developer (ODC)"/>
+                  <wp:cNvGraphicFramePr>
+                    <a:graphicFrameLocks xmlns:a="http://schemas.openxmlformats.org/drawingml/2006/main" noChangeAspect="1"/>
+                  </wp:cNvGraphicFramePr>
+                  <a:graphic xmlns:a="http://schemas.openxmlformats.org/drawingml/2006/main">
+                    <a:graphicData uri="http://schemas.openxmlformats.org/drawingml/2006/picture">
+                      <pic:pic xmlns:pic="http://schemas.openxmlformats.org/drawingml/2006/picture">
+                        <pic:nvPicPr>
+                          <pic:cNvPr id="0" name="" descr=""/>
+                          <pic:cNvPicPr>
+                            <a:picLocks noChangeAspect="1" noChangeArrowheads="1"/>
+                          </pic:cNvPicPr>
+                        </pic:nvPicPr>
+                        <pic:blipFill>
+                          <a:blip r:embed="rId15" cstate="none"/>
+                          <a:srcRect/>
+                          <a:stretch>
+                            <a:fillRect/>
+                          </a:stretch>
+                        </pic:blipFill>
+                        <pic:spPr bwMode="auto">
+                          <a:xfrm>
+                            <a:off x="0" y="0"/>
+                            <a:ext cx="438150" cy="476250"/>
+                          </a:xfrm>
+                          <a:prstGeom prst="rect">
+                            <a:avLst/>
+                          </a:prstGeom>
+                        </pic:spPr>
+                      </pic:pic>
+                    </a:graphicData>
+                  </a:graphic>
+                </wp:inline>
+              </w:drawing>
+            </w:r>
+          </w:p>
+        </w:tc>
+        <w:tc>
+          <w:tcPr>
+            <w:tcW w:type="dxa" w:w="6300"/>
+            <w:tcBorders>
+              <w:top w:val="none" w:color="FFFFFF" w:sz="0"/>
+              <w:left w:val="none" w:color="FFFFFF" w:sz="0"/>
+              <w:bottom w:val="single" w:color="E8EEF0" w:sz="4" w:space="1"/>
+              <w:right w:val="none" w:color="FFFFFF" w:sz="0"/>
+            </w:tcBorders>
+            <w:vAlign w:val="center"/>
+          </w:tcPr>
+          <w:p>
+            <w:pPr>
+              <w:spacing w:after="10" w:before="40"/>
+            </w:pPr>
+            <w:r>
+              <w:rPr>
+                <w:rFonts w:ascii="Calibri" w:cs="Calibri" w:eastAsia="Calibri" w:hAnsi="Calibri"/>
+                <w:b/>
+                <w:bCs/>
+                <w:color w:val="14232B"/>
+                <w:sz w:val="22"/>
+                <w:szCs w:val="22"/>
+              </w:rPr>
+              <w:t xml:space="preserve">Associate Developer (ODC)</w:t>
+            </w:r>
+          </w:p>
+          <w:p>
+            <w:pPr>
+              <w:spacing w:after="10" w:before="0"/>
+            </w:pPr>
+            <w:r>
+              <w:rPr>
+                <w:rFonts w:ascii="Calibri" w:cs="Calibri" w:eastAsia="Calibri" w:hAnsi="Calibri"/>
+                <w:b/>
+                <w:bCs/>
+                <w:color w:val="E4002B"/>
+                <w:sz w:val="17"/>
+                <w:szCs w:val="17"/>
+              </w:rPr>
+              <w:t xml:space="preserve">Associate  ·  Core Development  ·  ODC</w:t>
+            </w:r>
+          </w:p>
+          <w:p>
+            <w:pPr>
+              <w:spacing w:after="50" w:before="0"/>
+            </w:pPr>
+            <w:r>
+              <w:rPr>
+                <w:rFonts w:ascii="Calibri" w:cs="Calibri" w:eastAsia="Calibri" w:hAnsi="Calibri"/>
+                <w:color w:val="3A4D57"/>
+                <w:sz w:val="18"/>
+                <w:szCs w:val="18"/>
+              </w:rPr>
+              <w:t xml:space="preserve">Foundational OutSystems Developer Cloud capability</w:t>
+            </w:r>
+          </w:p>
+        </w:tc>
+      </w:tr>
+      <w:tr>
+        <w:tc>
+          <w:tcPr>
+            <w:tcW w:type="dxa" w:w="1400"/>
+            <w:tcBorders>
+              <w:top w:val="none" w:color="FFFFFF" w:sz="0"/>
+              <w:left w:val="none" w:color="FFFFFF" w:sz="0"/>
+              <w:bottom w:val="none" w:color="FFFFFF" w:sz="0"/>
+              <w:right w:val="none" w:color="FFFFFF" w:sz="0"/>
+            </w:tcBorders>
+            <w:vAlign w:val="center"/>
+          </w:tcPr>
+          <w:p>
+            <w:pPr>
+              <w:spacing w:after="0" w:before="40"/>
+              <w:jc w:val="right"/>
+            </w:pPr>
+            <w:r>
+              <w:rPr>
+                <w:rFonts w:ascii="Calibri" w:cs="Calibri" w:eastAsia="Calibri" w:hAnsi="Calibri"/>
+                <w:b/>
+                <w:bCs/>
+                <w:color w:val="0F4D48"/>
+                <w:sz w:val="18"/>
+                <w:szCs w:val="18"/>
+              </w:rPr>
+              <w:t xml:space="preserve">Jul 13, 2023</w:t>
+            </w:r>
+          </w:p>
+        </w:tc>
+        <w:tc>
+          <w:tcPr>
+            <w:tcW w:type="dxa" w:w="700"/>
+            <w:tcBorders>
+              <w:top w:val="none" w:color="FFFFFF" w:sz="0"/>
+              <w:left w:val="none" w:color="FFFFFF" w:sz="0"/>
+              <w:bottom w:val="none" w:color="FFFFFF" w:sz="0"/>
+              <w:right w:val="none" w:color="FFFFFF" w:sz="0"/>
+            </w:tcBorders>
+            <w:vAlign w:val="center"/>
+          </w:tcPr>
+          <w:p>
+            <w:pPr>
+              <w:spacing w:after="0" w:before="0"/>
+              <w:jc w:val="center"/>
+            </w:pPr>
+            <w:r>
+              <w:rPr>
+                <w:rFonts w:ascii="Calibri" w:cs="Calibri" w:eastAsia="Calibri" w:hAnsi="Calibri"/>
+                <w:color w:val="E4002B"/>
+                <w:sz w:val="28"/>
+                <w:szCs w:val="28"/>
+              </w:rPr>
+              <w:t xml:space="preserve">●</w:t>
+            </w:r>
+          </w:p>
+          <w:p>
+            <w:pPr>
+              <w:spacing w:after="0" w:before="0"/>
+              <w:jc w:val="center"/>
+            </w:pPr>
+            <w:r>
+              <w:rPr>
+                <w:rFonts w:ascii="Calibri" w:cs="Calibri" w:eastAsia="Calibri" w:hAnsi="Calibri"/>
+                <w:color w:val="F2A0A8"/>
+                <w:sz w:val="22"/>
+                <w:szCs w:val="22"/>
+              </w:rPr>
+              <w:t xml:space="preserve">│</w:t>
+            </w:r>
+          </w:p>
+        </w:tc>
+        <w:tc>
+          <w:tcPr>
+            <w:tcW w:type="dxa" w:w="1100"/>
+            <w:tcBorders>
+              <w:top w:val="none" w:color="FFFFFF" w:sz="0"/>
+              <w:left w:val="none" w:color="FFFFFF" w:sz="0"/>
+              <w:bottom w:val="none" w:color="FFFFFF" w:sz="0"/>
+              <w:right w:val="none" w:color="FFFFFF" w:sz="0"/>
+            </w:tcBorders>
+            <w:vAlign w:val="center"/>
+          </w:tcPr>
+          <w:p>
+            <w:pPr>
+              <w:spacing w:after="20" w:before="20"/>
+            </w:pPr>
+            <w:r>
+              <w:drawing>
+                <wp:inline distT="0" distB="0" distL="0" distR="0">
+                  <wp:extent cx="438150" cy="476250"/>
+                  <wp:effectExtent t="0" r="0" b="0" l="0"/>
+                  <wp:docPr id="1" name="mobile-specialist.png" descr="Mobile Developer Specialist (O11 and ODC) badge" title="Mobile Developer Specialist (O11 and ODC)"/>
+                  <wp:cNvGraphicFramePr>
+                    <a:graphicFrameLocks xmlns:a="http://schemas.openxmlformats.org/drawingml/2006/main" noChangeAspect="1"/>
+                  </wp:cNvGraphicFramePr>
+                  <a:graphic xmlns:a="http://schemas.openxmlformats.org/drawingml/2006/main">
+                    <a:graphicData uri="http://schemas.openxmlformats.org/drawingml/2006/picture">
+                      <pic:pic xmlns:pic="http://schemas.openxmlformats.org/drawingml/2006/picture">
+                        <pic:nvPicPr>
+                          <pic:cNvPr id="0" name="" descr=""/>
+                          <pic:cNvPicPr>
+                            <a:picLocks noChangeAspect="1" noChangeArrowheads="1"/>
+                          </pic:cNvPicPr>
+                        </pic:nvPicPr>
+                        <pic:blipFill>
+                          <a:blip r:embed="rId16" cstate="none"/>
+                          <a:srcRect/>
+                          <a:stretch>
+                            <a:fillRect/>
+                          </a:stretch>
+                        </pic:blipFill>
+                        <pic:spPr bwMode="auto">
+                          <a:xfrm>
+                            <a:off x="0" y="0"/>
+                            <a:ext cx="438150" cy="476250"/>
+                          </a:xfrm>
+                          <a:prstGeom prst="rect">
+                            <a:avLst/>
+                          </a:prstGeom>
+                        </pic:spPr>
+                      </pic:pic>
+                    </a:graphicData>
+                  </a:graphic>
+                </wp:inline>
+              </w:drawing>
+            </w:r>
+          </w:p>
+        </w:tc>
+        <w:tc>
+          <w:tcPr>
+            <w:tcW w:type="dxa" w:w="6300"/>
+            <w:tcBorders>
+              <w:top w:val="none" w:color="FFFFFF" w:sz="0"/>
+              <w:left w:val="none" w:color="FFFFFF" w:sz="0"/>
+              <w:bottom w:val="single" w:color="E8EEF0" w:sz="4" w:space="1"/>
+              <w:right w:val="none" w:color="FFFFFF" w:sz="0"/>
+            </w:tcBorders>
+            <w:vAlign w:val="center"/>
+          </w:tcPr>
+          <w:p>
+            <w:pPr>
+              <w:spacing w:after="10" w:before="40"/>
+            </w:pPr>
+            <w:r>
+              <w:rPr>
+                <w:rFonts w:ascii="Calibri" w:cs="Calibri" w:eastAsia="Calibri" w:hAnsi="Calibri"/>
+                <w:b/>
+                <w:bCs/>
+                <w:color w:val="14232B"/>
+                <w:sz w:val="22"/>
+                <w:szCs w:val="22"/>
+              </w:rPr>
+              <w:t xml:space="preserve">Mobile Developer Specialist (O11 and ODC)</w:t>
+            </w:r>
+          </w:p>
+          <w:p>
+            <w:pPr>
+              <w:spacing w:after="10" w:before="0"/>
+            </w:pPr>
+            <w:r>
+              <w:rPr>
+                <w:rFonts w:ascii="Calibri" w:cs="Calibri" w:eastAsia="Calibri" w:hAnsi="Calibri"/>
+                <w:b/>
+                <w:bCs/>
+                <w:color w:val="E4002B"/>
+                <w:sz w:val="17"/>
+                <w:szCs w:val="17"/>
+              </w:rPr>
+              <w:t xml:space="preserve">Specialist  ·  Mobile Development  ·  O11 &amp; ODC</w:t>
+            </w:r>
+          </w:p>
+          <w:p>
+            <w:pPr>
+              <w:spacing w:after="50" w:before="0"/>
+            </w:pPr>
+            <w:r>
+              <w:rPr>
+                <w:rFonts w:ascii="Calibri" w:cs="Calibri" w:eastAsia="Calibri" w:hAnsi="Calibri"/>
+                <w:color w:val="3A4D57"/>
+                <w:sz w:val="18"/>
+                <w:szCs w:val="18"/>
+              </w:rPr>
+              <w:t xml:space="preserve">Cross-platform mobile specialist skills on O11 and ODC</w:t>
+            </w:r>
+          </w:p>
+        </w:tc>
+      </w:tr>
+      <w:tr>
+        <w:tc>
+          <w:tcPr>
+            <w:tcW w:type="dxa" w:w="1400"/>
+            <w:tcBorders>
+              <w:top w:val="none" w:color="FFFFFF" w:sz="0"/>
+              <w:left w:val="none" w:color="FFFFFF" w:sz="0"/>
+              <w:bottom w:val="none" w:color="FFFFFF" w:sz="0"/>
+              <w:right w:val="none" w:color="FFFFFF" w:sz="0"/>
+            </w:tcBorders>
+            <w:vAlign w:val="center"/>
+          </w:tcPr>
+          <w:p>
+            <w:pPr>
+              <w:spacing w:after="0" w:before="40"/>
+              <w:jc w:val="right"/>
+            </w:pPr>
+            <w:r>
+              <w:rPr>
+                <w:rFonts w:ascii="Calibri" w:cs="Calibri" w:eastAsia="Calibri" w:hAnsi="Calibri"/>
+                <w:b/>
+                <w:bCs/>
+                <w:color w:val="0F4D48"/>
+                <w:sz w:val="18"/>
+                <w:szCs w:val="18"/>
+              </w:rPr>
+              <w:t xml:space="preserve">Jun 10, 2023</w:t>
+            </w:r>
+          </w:p>
+        </w:tc>
+        <w:tc>
+          <w:tcPr>
+            <w:tcW w:type="dxa" w:w="700"/>
+            <w:tcBorders>
+              <w:top w:val="none" w:color="FFFFFF" w:sz="0"/>
+              <w:left w:val="none" w:color="FFFFFF" w:sz="0"/>
+              <w:bottom w:val="none" w:color="FFFFFF" w:sz="0"/>
+              <w:right w:val="none" w:color="FFFFFF" w:sz="0"/>
+            </w:tcBorders>
+            <w:vAlign w:val="center"/>
+          </w:tcPr>
+          <w:p>
+            <w:pPr>
+              <w:spacing w:after="0" w:before="0"/>
+              <w:jc w:val="center"/>
+            </w:pPr>
+            <w:r>
+              <w:rPr>
+                <w:rFonts w:ascii="Calibri" w:cs="Calibri" w:eastAsia="Calibri" w:hAnsi="Calibri"/>
+                <w:color w:val="E4002B"/>
+                <w:sz w:val="28"/>
+                <w:szCs w:val="28"/>
+              </w:rPr>
+              <w:t xml:space="preserve">●</w:t>
+            </w:r>
+          </w:p>
+        </w:tc>
+        <w:tc>
+          <w:tcPr>
+            <w:tcW w:type="dxa" w:w="1100"/>
+            <w:tcBorders>
+              <w:top w:val="none" w:color="FFFFFF" w:sz="0"/>
+              <w:left w:val="none" w:color="FFFFFF" w:sz="0"/>
+              <w:bottom w:val="none" w:color="FFFFFF" w:sz="0"/>
+              <w:right w:val="none" w:color="FFFFFF" w:sz="0"/>
+            </w:tcBorders>
+            <w:vAlign w:val="center"/>
+          </w:tcPr>
+          <w:p>
+            <w:pPr>
+              <w:spacing w:after="20" w:before="20"/>
+            </w:pPr>
+            <w:r>
+              <w:drawing>
+                <wp:inline distT="0" distB="0" distL="0" distR="0">
+                  <wp:extent cx="438150" cy="476250"/>
+                  <wp:effectExtent t="0" r="0" b="0" l="0"/>
+                  <wp:docPr id="1" name="associate.png" descr="Associate Developer (O11) badge" title="Associate Developer (O11)"/>
+                  <wp:cNvGraphicFramePr>
+                    <a:graphicFrameLocks xmlns:a="http://schemas.openxmlformats.org/drawingml/2006/main" noChangeAspect="1"/>
+                  </wp:cNvGraphicFramePr>
+                  <a:graphic xmlns:a="http://schemas.openxmlformats.org/drawingml/2006/main">
+                    <a:graphicData uri="http://schemas.openxmlformats.org/drawingml/2006/picture">
+                      <pic:pic xmlns:pic="http://schemas.openxmlformats.org/drawingml/2006/picture">
+                        <pic:nvPicPr>
+                          <pic:cNvPr id="0" name="" descr=""/>
+                          <pic:cNvPicPr>
+                            <a:picLocks noChangeAspect="1" noChangeArrowheads="1"/>
+                          </pic:cNvPicPr>
+                        </pic:nvPicPr>
+                        <pic:blipFill>
+                          <a:blip r:embed="rId15" cstate="none"/>
+                          <a:srcRect/>
+                          <a:stretch>
+                            <a:fillRect/>
+                          </a:stretch>
+                        </pic:blipFill>
+                        <pic:spPr bwMode="auto">
+                          <a:xfrm>
+                            <a:off x="0" y="0"/>
+                            <a:ext cx="438150" cy="476250"/>
+                          </a:xfrm>
+                          <a:prstGeom prst="rect">
+                            <a:avLst/>
+                          </a:prstGeom>
+                        </pic:spPr>
+                      </pic:pic>
+                    </a:graphicData>
+                  </a:graphic>
+                </wp:inline>
+              </w:drawing>
+            </w:r>
+          </w:p>
+        </w:tc>
+        <w:tc>
+          <w:tcPr>
+            <w:tcW w:type="dxa" w:w="6300"/>
+            <w:tcBorders>
+              <w:top w:val="none" w:color="FFFFFF" w:sz="0"/>
+              <w:left w:val="none" w:color="FFFFFF" w:sz="0"/>
+              <w:bottom w:val="single" w:color="E8EEF0" w:sz="4" w:space="1"/>
+              <w:right w:val="none" w:color="FFFFFF" w:sz="0"/>
+            </w:tcBorders>
+            <w:vAlign w:val="center"/>
+          </w:tcPr>
+          <w:p>
+            <w:pPr>
+              <w:spacing w:after="10" w:before="40"/>
+            </w:pPr>
+            <w:r>
+              <w:rPr>
+                <w:rFonts w:ascii="Calibri" w:cs="Calibri" w:eastAsia="Calibri" w:hAnsi="Calibri"/>
+                <w:b/>
+                <w:bCs/>
+                <w:color w:val="14232B"/>
+                <w:sz w:val="22"/>
+                <w:szCs w:val="22"/>
+              </w:rPr>
+              <w:t xml:space="preserve">Associate Developer (O11)</w:t>
+            </w:r>
+          </w:p>
+          <w:p>
+            <w:pPr>
+              <w:spacing w:after="10" w:before="0"/>
+            </w:pPr>
+            <w:r>
+              <w:rPr>
+                <w:rFonts w:ascii="Calibri" w:cs="Calibri" w:eastAsia="Calibri" w:hAnsi="Calibri"/>
+                <w:b/>
+                <w:bCs/>
+                <w:color w:val="E4002B"/>
+                <w:sz w:val="17"/>
+                <w:szCs w:val="17"/>
+              </w:rPr>
+              <w:t xml:space="preserve">Associate  ·  Core Development  ·  O11</w:t>
+            </w:r>
+          </w:p>
+          <w:p>
+            <w:pPr>
+              <w:spacing w:after="50" w:before="0"/>
+            </w:pPr>
+            <w:r>
+              <w:rPr>
+                <w:rFonts w:ascii="Calibri" w:cs="Calibri" w:eastAsia="Calibri" w:hAnsi="Calibri"/>
+                <w:color w:val="3A4D57"/>
+                <w:sz w:val="18"/>
+                <w:szCs w:val="18"/>
+              </w:rPr>
+              <w:t xml:space="preserve">Entry point of the OutSystems certification journey</w:t>
+            </w:r>
+          </w:p>
+        </w:tc>
+      </w:tr>
+    </w:tbl>
+    <w:p>
+      <w:pPr>
+        <w:spacing w:before="180"/>
         <w:jc w:val="center"/>
       </w:pPr>
       <w:r>
-        <w:drawing>
-          <wp:inline distT="0" distB="0" distL="0" distR="0">
-            <wp:extent cx="7372350" cy="10487025"/>
-            <wp:effectExtent t="0" r="0" b="0" l="0"/>
-            <wp:docPr id="1" name="outsystems-certifications" descr="Consolidated OutSystems certification certificate for Mohammed Younus Mohiuddin" title="OutSystems certifications"/>
-            <wp:cNvGraphicFramePr>
-              <a:graphicFrameLocks xmlns:a="http://schemas.openxmlformats.org/drawingml/2006/main" noChangeAspect="1"/>
-            </wp:cNvGraphicFramePr>
-            <a:graphic xmlns:a="http://schemas.openxmlformats.org/drawingml/2006/main">
-              <a:graphicData uri="http://schemas.openxmlformats.org/drawingml/2006/picture">
-                <pic:pic xmlns:pic="http://schemas.openxmlformats.org/drawingml/2006/picture">
-                  <pic:nvPicPr>
-                    <pic:cNvPr id="0" name="" descr=""/>
-                    <pic:cNvPicPr>
-                      <a:picLocks noChangeAspect="1" noChangeArrowheads="1"/>
-                    </pic:cNvPicPr>
-                  </pic:nvPicPr>
-                  <pic:blipFill>
-                    <a:blip r:embed="rId7" cstate="none"/>
-                    <a:srcRect/>
-                    <a:stretch>
-                      <a:fillRect/>
-                    </a:stretch>
-                  </pic:blipFill>
-                  <pic:spPr bwMode="auto">
-                    <a:xfrm>
-                      <a:off x="0" y="0"/>
-                      <a:ext cx="7372350" cy="10487025"/>
-                    </a:xfrm>
-                    <a:prstGeom prst="rect">
-                      <a:avLst/>
-                    </a:prstGeom>
-                  </pic:spPr>
-                </pic:pic>
-              </a:graphicData>
-            </a:graphic>
-          </wp:inline>
-        </w:drawing>
+        <w:rPr>
+          <w:rFonts w:ascii="Calibri" w:cs="Calibri" w:eastAsia="Calibri" w:hAnsi="Calibri"/>
+          <w:i/>
+          <w:iCs/>
+          <w:color w:val="3A4D57"/>
+          <w:sz w:val="15"/>
+          <w:szCs w:val="15"/>
+        </w:rPr>
+        <w:t xml:space="preserve">Source: Official OutSystems Certification Transcript  ·  outsystems.com/certifications</w:t>
       </w:r>
     </w:p>
     <w:sectPr>
       <w:pgSz w:w="11906" w:h="16838" w:orient="portrait"/>
-      <w:pgMar w:top="144" w:right="144" w:bottom="144" w:left="144" w:header="708" w:footer="708" w:gutter="0"/>
+      <w:pgMar w:top="540" w:right="540" w:bottom="540" w:left="540" w:header="708" w:footer="708" w:gutter="0"/>
       <w:pgNumType/>
       <w:docGrid w:linePitch="360"/>
     </w:sectPr>

</xml_diff>

<commit_message>
Use official OutSystems badges in a certifications timeline
Replace the certificate image and synthetic icons with transcript
badge crops, and present a newest-first journey timeline on the site
and Word/PDF CVs for a stronger interviewer narrative.

Co-authored-by: myounusm <myounusm@users.noreply.github.com>
</commit_message>
<xml_diff>
--- a/public/Mohammed_Younus_CV.docx
+++ b/public/Mohammed_Younus_CV.docx
@@ -93,7 +93,7 @@
           <w:sz w:val="24"/>
           <w:szCs w:val="24"/>
         </w:rPr>
-        <w:t xml:space="preserve">Tech Lead with 21+ years of software development experience across the insurance, aviation, and software industries. Holds 12 OutSystems certifications, including Professional Developer and Architecture Specialist, and is certified in Microsoft Azure AI. Expert in enterprise solution design, digital transformation, and building scalable, high-performance systems — from architecture and integrations to mentoring teams and engaging business stakeholders.</w:t>
+        <w:t xml:space="preserve">Tech Lead with 21+ years of software development experience across the insurance, aviation, and software industries. Holds 13 OutSystems certifications, including Professional Developer and Architecture Specialist, and is certified in Microsoft Azure AI. Expert in enterprise solution design, digital transformation, and building scalable, high-performance systems — from architecture and integrations to mentoring teams and engaging business stakeholders.</w:t>
       </w:r>
     </w:p>
     <w:p>
@@ -1826,7 +1826,7 @@
                 <wp:inline distT="0" distB="0" distL="0" distR="0">
                   <wp:extent cx="438150" cy="476250"/>
                   <wp:effectExtent t="0" r="0" b="0" l="0"/>
-                  <wp:docPr id="1" name="architecture.png" descr="Architecture Specialist (ODC) badge" title="Architecture Specialist (ODC)"/>
+                  <wp:docPr id="1" name="architecture-odc.png" descr="Architecture Specialist (ODC) badge" title="Architecture Specialist (ODC)"/>
                   <wp:cNvGraphicFramePr>
                     <a:graphicFrameLocks xmlns:a="http://schemas.openxmlformats.org/drawingml/2006/main" noChangeAspect="1"/>
                   </wp:cNvGraphicFramePr>
@@ -2390,7 +2390,7 @@
                 <wp:inline distT="0" distB="0" distL="0" distR="0">
                   <wp:extent cx="438150" cy="476250"/>
                   <wp:effectExtent t="0" r="0" b="0" l="0"/>
-                  <wp:docPr id="1" name="web-specialist.png" descr="Web Developer Specialist (ODC) badge" title="Web Developer Specialist (ODC)"/>
+                  <wp:docPr id="1" name="web-specialist-odc.png" descr="Web Developer Specialist (ODC) badge" title="Web Developer Specialist (ODC)"/>
                   <wp:cNvGraphicFramePr>
                     <a:graphicFrameLocks xmlns:a="http://schemas.openxmlformats.org/drawingml/2006/main" noChangeAspect="1"/>
                   </wp:cNvGraphicFramePr>
@@ -2766,195 +2766,7 @@
                 <wp:inline distT="0" distB="0" distL="0" distR="0">
                   <wp:extent cx="438150" cy="476250"/>
                   <wp:effectExtent t="0" r="0" b="0" l="0"/>
-                  <wp:docPr id="1" name="architecture.png" descr="Architecture Specialist (O11) badge" title="Architecture Specialist (O11)"/>
-                  <wp:cNvGraphicFramePr>
-                    <a:graphicFrameLocks xmlns:a="http://schemas.openxmlformats.org/drawingml/2006/main" noChangeAspect="1"/>
-                  </wp:cNvGraphicFramePr>
-                  <a:graphic xmlns:a="http://schemas.openxmlformats.org/drawingml/2006/main">
-                    <a:graphicData uri="http://schemas.openxmlformats.org/drawingml/2006/picture">
-                      <pic:pic xmlns:pic="http://schemas.openxmlformats.org/drawingml/2006/picture">
-                        <pic:nvPicPr>
-                          <pic:cNvPr id="0" name="" descr=""/>
-                          <pic:cNvPicPr>
-                            <a:picLocks noChangeAspect="1" noChangeArrowheads="1"/>
-                          </pic:cNvPicPr>
-                        </pic:nvPicPr>
-                        <pic:blipFill>
-                          <a:blip r:embed="rId7" cstate="none"/>
-                          <a:srcRect/>
-                          <a:stretch>
-                            <a:fillRect/>
-                          </a:stretch>
-                        </pic:blipFill>
-                        <pic:spPr bwMode="auto">
-                          <a:xfrm>
-                            <a:off x="0" y="0"/>
-                            <a:ext cx="438150" cy="476250"/>
-                          </a:xfrm>
-                          <a:prstGeom prst="rect">
-                            <a:avLst/>
-                          </a:prstGeom>
-                        </pic:spPr>
-                      </pic:pic>
-                    </a:graphicData>
-                  </a:graphic>
-                </wp:inline>
-              </w:drawing>
-            </w:r>
-          </w:p>
-        </w:tc>
-        <w:tc>
-          <w:tcPr>
-            <w:tcW w:type="dxa" w:w="6300"/>
-            <w:tcBorders>
-              <w:top w:val="none" w:color="FFFFFF" w:sz="0"/>
-              <w:left w:val="none" w:color="FFFFFF" w:sz="0"/>
-              <w:bottom w:val="single" w:color="E8EEF0" w:sz="4" w:space="1"/>
-              <w:right w:val="none" w:color="FFFFFF" w:sz="0"/>
-            </w:tcBorders>
-            <w:vAlign w:val="center"/>
-          </w:tcPr>
-          <w:p>
-            <w:pPr>
-              <w:spacing w:after="10" w:before="40"/>
-            </w:pPr>
-            <w:r>
-              <w:rPr>
-                <w:rFonts w:ascii="Calibri" w:cs="Calibri" w:eastAsia="Calibri" w:hAnsi="Calibri"/>
-                <w:b/>
-                <w:bCs/>
-                <w:color w:val="14232B"/>
-                <w:sz w:val="22"/>
-                <w:szCs w:val="22"/>
-              </w:rPr>
-              <w:t xml:space="preserve">Architecture Specialist (O11)</w:t>
-            </w:r>
-          </w:p>
-          <w:p>
-            <w:pPr>
-              <w:spacing w:after="10" w:before="0"/>
-            </w:pPr>
-            <w:r>
-              <w:rPr>
-                <w:rFonts w:ascii="Calibri" w:cs="Calibri" w:eastAsia="Calibri" w:hAnsi="Calibri"/>
-                <w:b/>
-                <w:bCs/>
-                <w:color w:val="E4002B"/>
-                <w:sz w:val="17"/>
-                <w:szCs w:val="17"/>
-              </w:rPr>
-              <w:t xml:space="preserve">Specialist  ·  Architecture  ·  O11</w:t>
-            </w:r>
-          </w:p>
-          <w:p>
-            <w:pPr>
-              <w:spacing w:after="50" w:before="0"/>
-            </w:pPr>
-            <w:r>
-              <w:rPr>
-                <w:rFonts w:ascii="Calibri" w:cs="Calibri" w:eastAsia="Calibri" w:hAnsi="Calibri"/>
-                <w:color w:val="3A4D57"/>
-                <w:sz w:val="18"/>
-                <w:szCs w:val="18"/>
-              </w:rPr>
-              <w:t xml:space="preserve">Enterprise architecture, module design, and long-term maintainability</w:t>
-            </w:r>
-          </w:p>
-        </w:tc>
-      </w:tr>
-      <w:tr>
-        <w:tc>
-          <w:tcPr>
-            <w:tcW w:type="dxa" w:w="1400"/>
-            <w:tcBorders>
-              <w:top w:val="none" w:color="FFFFFF" w:sz="0"/>
-              <w:left w:val="none" w:color="FFFFFF" w:sz="0"/>
-              <w:bottom w:val="none" w:color="FFFFFF" w:sz="0"/>
-              <w:right w:val="none" w:color="FFFFFF" w:sz="0"/>
-            </w:tcBorders>
-            <w:vAlign w:val="center"/>
-          </w:tcPr>
-          <w:p>
-            <w:pPr>
-              <w:spacing w:after="0" w:before="40"/>
-              <w:jc w:val="right"/>
-            </w:pPr>
-            <w:r>
-              <w:rPr>
-                <w:rFonts w:ascii="Calibri" w:cs="Calibri" w:eastAsia="Calibri" w:hAnsi="Calibri"/>
-                <w:b/>
-                <w:bCs/>
-                <w:color w:val="0F4D48"/>
-                <w:sz w:val="18"/>
-                <w:szCs w:val="18"/>
-              </w:rPr>
-              <w:t xml:space="preserve">Nov 03, 2023</w:t>
-            </w:r>
-          </w:p>
-        </w:tc>
-        <w:tc>
-          <w:tcPr>
-            <w:tcW w:type="dxa" w:w="700"/>
-            <w:tcBorders>
-              <w:top w:val="none" w:color="FFFFFF" w:sz="0"/>
-              <w:left w:val="none" w:color="FFFFFF" w:sz="0"/>
-              <w:bottom w:val="none" w:color="FFFFFF" w:sz="0"/>
-              <w:right w:val="none" w:color="FFFFFF" w:sz="0"/>
-            </w:tcBorders>
-            <w:vAlign w:val="center"/>
-          </w:tcPr>
-          <w:p>
-            <w:pPr>
-              <w:spacing w:after="0" w:before="0"/>
-              <w:jc w:val="center"/>
-            </w:pPr>
-            <w:r>
-              <w:rPr>
-                <w:rFonts w:ascii="Calibri" w:cs="Calibri" w:eastAsia="Calibri" w:hAnsi="Calibri"/>
-                <w:color w:val="E4002B"/>
-                <w:sz w:val="28"/>
-                <w:szCs w:val="28"/>
-              </w:rPr>
-              <w:t xml:space="preserve">●</w:t>
-            </w:r>
-          </w:p>
-          <w:p>
-            <w:pPr>
-              <w:spacing w:after="0" w:before="0"/>
-              <w:jc w:val="center"/>
-            </w:pPr>
-            <w:r>
-              <w:rPr>
-                <w:rFonts w:ascii="Calibri" w:cs="Calibri" w:eastAsia="Calibri" w:hAnsi="Calibri"/>
-                <w:color w:val="F2A0A8"/>
-                <w:sz w:val="22"/>
-                <w:szCs w:val="22"/>
-              </w:rPr>
-              <w:t xml:space="preserve">│</w:t>
-            </w:r>
-          </w:p>
-        </w:tc>
-        <w:tc>
-          <w:tcPr>
-            <w:tcW w:type="dxa" w:w="1100"/>
-            <w:tcBorders>
-              <w:top w:val="none" w:color="FFFFFF" w:sz="0"/>
-              <w:left w:val="none" w:color="FFFFFF" w:sz="0"/>
-              <w:bottom w:val="none" w:color="FFFFFF" w:sz="0"/>
-              <w:right w:val="none" w:color="FFFFFF" w:sz="0"/>
-            </w:tcBorders>
-            <w:vAlign w:val="center"/>
-          </w:tcPr>
-          <w:p>
-            <w:pPr>
-              <w:spacing w:after="20" w:before="20"/>
-            </w:pPr>
-            <w:r>
-              <w:drawing>
-                <wp:inline distT="0" distB="0" distL="0" distR="0">
-                  <wp:extent cx="438150" cy="476250"/>
-                  <wp:effectExtent t="0" r="0" b="0" l="0"/>
-                  <wp:docPr id="1" name="professional-web.png" descr="Professional Web Developer (O11) badge" title="Professional Web Developer (O11)"/>
+                  <wp:docPr id="1" name="architecture-o11.png" descr="Architecture Specialist (O11) badge" title="Architecture Specialist (O11)"/>
                   <wp:cNvGraphicFramePr>
                     <a:graphicFrameLocks xmlns:a="http://schemas.openxmlformats.org/drawingml/2006/main" noChangeAspect="1"/>
                   </wp:cNvGraphicFramePr>
@@ -3015,7 +2827,7 @@
                 <w:sz w:val="22"/>
                 <w:szCs w:val="22"/>
               </w:rPr>
-              <w:t xml:space="preserve">Professional Web Developer (O11)</w:t>
+              <w:t xml:space="preserve">Architecture Specialist (O11)</w:t>
             </w:r>
           </w:p>
           <w:p>
@@ -3031,7 +2843,7 @@
                 <w:sz w:val="17"/>
                 <w:szCs w:val="17"/>
               </w:rPr>
-              <w:t xml:space="preserve">Professional  ·  Web Development  ·  O11</w:t>
+              <w:t xml:space="preserve">Specialist  ·  Architecture  ·  O11</w:t>
             </w:r>
           </w:p>
           <w:p>
@@ -3045,7 +2857,7 @@
                 <w:sz w:val="18"/>
                 <w:szCs w:val="18"/>
               </w:rPr>
-              <w:t xml:space="preserve">Professional-grade Reactive/Web application development</w:t>
+              <w:t xml:space="preserve">Enterprise architecture, module design, and long-term maintainability</w:t>
             </w:r>
           </w:p>
         </w:tc>
@@ -3142,7 +2954,7 @@
                 <wp:inline distT="0" distB="0" distL="0" distR="0">
                   <wp:extent cx="438150" cy="476250"/>
                   <wp:effectExtent t="0" r="0" b="0" l="0"/>
-                  <wp:docPr id="1" name="professional-mobile.png" descr="Professional Mobile Developer (O11) badge" title="Professional Mobile Developer (O11)"/>
+                  <wp:docPr id="1" name="professional-web.png" descr="Professional Web Developer (O11) badge" title="Professional Web Developer (O11)"/>
                   <wp:cNvGraphicFramePr>
                     <a:graphicFrameLocks xmlns:a="http://schemas.openxmlformats.org/drawingml/2006/main" noChangeAspect="1"/>
                   </wp:cNvGraphicFramePr>
@@ -3203,7 +3015,7 @@
                 <w:sz w:val="22"/>
                 <w:szCs w:val="22"/>
               </w:rPr>
-              <w:t xml:space="preserve">Professional Mobile Developer (O11)</w:t>
+              <w:t xml:space="preserve">Professional Web Developer (O11)</w:t>
             </w:r>
           </w:p>
           <w:p>
@@ -3219,7 +3031,7 @@
                 <w:sz w:val="17"/>
                 <w:szCs w:val="17"/>
               </w:rPr>
-              <w:t xml:space="preserve">Professional  ·  Mobile Development  ·  O11</w:t>
+              <w:t xml:space="preserve">Professional  ·  Web Development  ·  O11</w:t>
             </w:r>
           </w:p>
           <w:p>
@@ -3233,7 +3045,7 @@
                 <w:sz w:val="18"/>
                 <w:szCs w:val="18"/>
               </w:rPr>
-              <w:t xml:space="preserve">Mobile delivery with professional OutSystems mobile patterns</w:t>
+              <w:t xml:space="preserve">Professional-grade Reactive/Web application development</w:t>
             </w:r>
           </w:p>
         </w:tc>
@@ -3264,7 +3076,7 @@
                 <w:sz w:val="18"/>
                 <w:szCs w:val="18"/>
               </w:rPr>
-              <w:t xml:space="preserve">Sep 13, 2023</w:t>
+              <w:t xml:space="preserve">Nov 03, 2023</w:t>
             </w:r>
           </w:p>
         </w:tc>
@@ -3330,7 +3142,7 @@
                 <wp:inline distT="0" distB="0" distL="0" distR="0">
                   <wp:extent cx="438150" cy="476250"/>
                   <wp:effectExtent t="0" r="0" b="0" l="0"/>
-                  <wp:docPr id="1" name="security-specialist.png" descr="Security Specialist (O11 and ODC) badge" title="Security Specialist (O11 and ODC)"/>
+                  <wp:docPr id="1" name="professional-mobile.png" descr="Professional Mobile Developer (O11) badge" title="Professional Mobile Developer (O11)"/>
                   <wp:cNvGraphicFramePr>
                     <a:graphicFrameLocks xmlns:a="http://schemas.openxmlformats.org/drawingml/2006/main" noChangeAspect="1"/>
                   </wp:cNvGraphicFramePr>
@@ -3391,7 +3203,7 @@
                 <w:sz w:val="22"/>
                 <w:szCs w:val="22"/>
               </w:rPr>
-              <w:t xml:space="preserve">Security Specialist (O11 and ODC)</w:t>
+              <w:t xml:space="preserve">Professional Mobile Developer (O11)</w:t>
             </w:r>
           </w:p>
           <w:p>
@@ -3407,7 +3219,7 @@
                 <w:sz w:val="17"/>
                 <w:szCs w:val="17"/>
               </w:rPr>
-              <w:t xml:space="preserve">Specialist  ·  Security  ·  O11 &amp; ODC</w:t>
+              <w:t xml:space="preserve">Professional  ·  Mobile Development  ·  O11</w:t>
             </w:r>
           </w:p>
           <w:p>
@@ -3421,7 +3233,7 @@
                 <w:sz w:val="18"/>
                 <w:szCs w:val="18"/>
               </w:rPr>
-              <w:t xml:space="preserve">Secure design, authentication, and platform security best practices</w:t>
+              <w:t xml:space="preserve">Mobile delivery with professional OutSystems mobile patterns</w:t>
             </w:r>
           </w:p>
         </w:tc>
@@ -3452,7 +3264,7 @@
                 <w:sz w:val="18"/>
                 <w:szCs w:val="18"/>
               </w:rPr>
-              <w:t xml:space="preserve">Aug 25, 2023</w:t>
+              <w:t xml:space="preserve">Sep 13, 2023</w:t>
             </w:r>
           </w:p>
         </w:tc>
@@ -3518,195 +3330,7 @@
                 <wp:inline distT="0" distB="0" distL="0" distR="0">
                   <wp:extent cx="438150" cy="476250"/>
                   <wp:effectExtent t="0" r="0" b="0" l="0"/>
-                  <wp:docPr id="1" name="web-specialist.png" descr="Web Developer Specialist (O11) badge" title="Web Developer Specialist (O11)"/>
-                  <wp:cNvGraphicFramePr>
-                    <a:graphicFrameLocks xmlns:a="http://schemas.openxmlformats.org/drawingml/2006/main" noChangeAspect="1"/>
-                  </wp:cNvGraphicFramePr>
-                  <a:graphic xmlns:a="http://schemas.openxmlformats.org/drawingml/2006/main">
-                    <a:graphicData uri="http://schemas.openxmlformats.org/drawingml/2006/picture">
-                      <pic:pic xmlns:pic="http://schemas.openxmlformats.org/drawingml/2006/picture">
-                        <pic:nvPicPr>
-                          <pic:cNvPr id="0" name="" descr=""/>
-                          <pic:cNvPicPr>
-                            <a:picLocks noChangeAspect="1" noChangeArrowheads="1"/>
-                          </pic:cNvPicPr>
-                        </pic:nvPicPr>
-                        <pic:blipFill>
-                          <a:blip r:embed="rId10" cstate="none"/>
-                          <a:srcRect/>
-                          <a:stretch>
-                            <a:fillRect/>
-                          </a:stretch>
-                        </pic:blipFill>
-                        <pic:spPr bwMode="auto">
-                          <a:xfrm>
-                            <a:off x="0" y="0"/>
-                            <a:ext cx="438150" cy="476250"/>
-                          </a:xfrm>
-                          <a:prstGeom prst="rect">
-                            <a:avLst/>
-                          </a:prstGeom>
-                        </pic:spPr>
-                      </pic:pic>
-                    </a:graphicData>
-                  </a:graphic>
-                </wp:inline>
-              </w:drawing>
-            </w:r>
-          </w:p>
-        </w:tc>
-        <w:tc>
-          <w:tcPr>
-            <w:tcW w:type="dxa" w:w="6300"/>
-            <w:tcBorders>
-              <w:top w:val="none" w:color="FFFFFF" w:sz="0"/>
-              <w:left w:val="none" w:color="FFFFFF" w:sz="0"/>
-              <w:bottom w:val="single" w:color="E8EEF0" w:sz="4" w:space="1"/>
-              <w:right w:val="none" w:color="FFFFFF" w:sz="0"/>
-            </w:tcBorders>
-            <w:vAlign w:val="center"/>
-          </w:tcPr>
-          <w:p>
-            <w:pPr>
-              <w:spacing w:after="10" w:before="40"/>
-            </w:pPr>
-            <w:r>
-              <w:rPr>
-                <w:rFonts w:ascii="Calibri" w:cs="Calibri" w:eastAsia="Calibri" w:hAnsi="Calibri"/>
-                <w:b/>
-                <w:bCs/>
-                <w:color w:val="14232B"/>
-                <w:sz w:val="22"/>
-                <w:szCs w:val="22"/>
-              </w:rPr>
-              <w:t xml:space="preserve">Web Developer Specialist (O11)</w:t>
-            </w:r>
-          </w:p>
-          <w:p>
-            <w:pPr>
-              <w:spacing w:after="10" w:before="0"/>
-            </w:pPr>
-            <w:r>
-              <w:rPr>
-                <w:rFonts w:ascii="Calibri" w:cs="Calibri" w:eastAsia="Calibri" w:hAnsi="Calibri"/>
-                <w:b/>
-                <w:bCs/>
-                <w:color w:val="E4002B"/>
-                <w:sz w:val="17"/>
-                <w:szCs w:val="17"/>
-              </w:rPr>
-              <w:t xml:space="preserve">Specialist  ·  Web Development  ·  O11</w:t>
-            </w:r>
-          </w:p>
-          <w:p>
-            <w:pPr>
-              <w:spacing w:after="50" w:before="0"/>
-            </w:pPr>
-            <w:r>
-              <w:rPr>
-                <w:rFonts w:ascii="Calibri" w:cs="Calibri" w:eastAsia="Calibri" w:hAnsi="Calibri"/>
-                <w:color w:val="3A4D57"/>
-                <w:sz w:val="18"/>
-                <w:szCs w:val="18"/>
-              </w:rPr>
-              <w:t xml:space="preserve">Specialist web patterns beyond professional developer baseline</w:t>
-            </w:r>
-          </w:p>
-        </w:tc>
-      </w:tr>
-      <w:tr>
-        <w:tc>
-          <w:tcPr>
-            <w:tcW w:type="dxa" w:w="1400"/>
-            <w:tcBorders>
-              <w:top w:val="none" w:color="FFFFFF" w:sz="0"/>
-              <w:left w:val="none" w:color="FFFFFF" w:sz="0"/>
-              <w:bottom w:val="none" w:color="FFFFFF" w:sz="0"/>
-              <w:right w:val="none" w:color="FFFFFF" w:sz="0"/>
-            </w:tcBorders>
-            <w:vAlign w:val="center"/>
-          </w:tcPr>
-          <w:p>
-            <w:pPr>
-              <w:spacing w:after="0" w:before="40"/>
-              <w:jc w:val="right"/>
-            </w:pPr>
-            <w:r>
-              <w:rPr>
-                <w:rFonts w:ascii="Calibri" w:cs="Calibri" w:eastAsia="Calibri" w:hAnsi="Calibri"/>
-                <w:b/>
-                <w:bCs/>
-                <w:color w:val="0F4D48"/>
-                <w:sz w:val="18"/>
-                <w:szCs w:val="18"/>
-              </w:rPr>
-              <w:t xml:space="preserve">Jul 24, 2023</w:t>
-            </w:r>
-          </w:p>
-        </w:tc>
-        <w:tc>
-          <w:tcPr>
-            <w:tcW w:type="dxa" w:w="700"/>
-            <w:tcBorders>
-              <w:top w:val="none" w:color="FFFFFF" w:sz="0"/>
-              <w:left w:val="none" w:color="FFFFFF" w:sz="0"/>
-              <w:bottom w:val="none" w:color="FFFFFF" w:sz="0"/>
-              <w:right w:val="none" w:color="FFFFFF" w:sz="0"/>
-            </w:tcBorders>
-            <w:vAlign w:val="center"/>
-          </w:tcPr>
-          <w:p>
-            <w:pPr>
-              <w:spacing w:after="0" w:before="0"/>
-              <w:jc w:val="center"/>
-            </w:pPr>
-            <w:r>
-              <w:rPr>
-                <w:rFonts w:ascii="Calibri" w:cs="Calibri" w:eastAsia="Calibri" w:hAnsi="Calibri"/>
-                <w:color w:val="E4002B"/>
-                <w:sz w:val="28"/>
-                <w:szCs w:val="28"/>
-              </w:rPr>
-              <w:t xml:space="preserve">●</w:t>
-            </w:r>
-          </w:p>
-          <w:p>
-            <w:pPr>
-              <w:spacing w:after="0" w:before="0"/>
-              <w:jc w:val="center"/>
-            </w:pPr>
-            <w:r>
-              <w:rPr>
-                <w:rFonts w:ascii="Calibri" w:cs="Calibri" w:eastAsia="Calibri" w:hAnsi="Calibri"/>
-                <w:color w:val="F2A0A8"/>
-                <w:sz w:val="22"/>
-                <w:szCs w:val="22"/>
-              </w:rPr>
-              <w:t xml:space="preserve">│</w:t>
-            </w:r>
-          </w:p>
-        </w:tc>
-        <w:tc>
-          <w:tcPr>
-            <w:tcW w:type="dxa" w:w="1100"/>
-            <w:tcBorders>
-              <w:top w:val="none" w:color="FFFFFF" w:sz="0"/>
-              <w:left w:val="none" w:color="FFFFFF" w:sz="0"/>
-              <w:bottom w:val="none" w:color="FFFFFF" w:sz="0"/>
-              <w:right w:val="none" w:color="FFFFFF" w:sz="0"/>
-            </w:tcBorders>
-            <w:vAlign w:val="center"/>
-          </w:tcPr>
-          <w:p>
-            <w:pPr>
-              <w:spacing w:after="20" w:before="20"/>
-            </w:pPr>
-            <w:r>
-              <w:drawing>
-                <wp:inline distT="0" distB="0" distL="0" distR="0">
-                  <wp:extent cx="438150" cy="476250"/>
-                  <wp:effectExtent t="0" r="0" b="0" l="0"/>
-                  <wp:docPr id="1" name="associate.png" descr="Associate Developer (ODC) badge" title="Associate Developer (ODC)"/>
+                  <wp:docPr id="1" name="security-specialist.png" descr="Security Specialist (O11 and ODC) badge" title="Security Specialist (O11 and ODC)"/>
                   <wp:cNvGraphicFramePr>
                     <a:graphicFrameLocks xmlns:a="http://schemas.openxmlformats.org/drawingml/2006/main" noChangeAspect="1"/>
                   </wp:cNvGraphicFramePr>
@@ -3767,7 +3391,7 @@
                 <w:sz w:val="22"/>
                 <w:szCs w:val="22"/>
               </w:rPr>
-              <w:t xml:space="preserve">Associate Developer (ODC)</w:t>
+              <w:t xml:space="preserve">Security Specialist (O11 and ODC)</w:t>
             </w:r>
           </w:p>
           <w:p>
@@ -3783,7 +3407,7 @@
                 <w:sz w:val="17"/>
                 <w:szCs w:val="17"/>
               </w:rPr>
-              <w:t xml:space="preserve">Associate  ·  Core Development  ·  ODC</w:t>
+              <w:t xml:space="preserve">Specialist  ·  Security  ·  O11 &amp; ODC</w:t>
             </w:r>
           </w:p>
           <w:p>
@@ -3797,7 +3421,7 @@
                 <w:sz w:val="18"/>
                 <w:szCs w:val="18"/>
               </w:rPr>
-              <w:t xml:space="preserve">Foundational OutSystems Developer Cloud capability</w:t>
+              <w:t xml:space="preserve">Secure design, authentication, and platform security best practices</w:t>
             </w:r>
           </w:p>
         </w:tc>
@@ -3828,7 +3452,7 @@
                 <w:sz w:val="18"/>
                 <w:szCs w:val="18"/>
               </w:rPr>
-              <w:t xml:space="preserve">Jul 13, 2023</w:t>
+              <w:t xml:space="preserve">Aug 25, 2023</w:t>
             </w:r>
           </w:p>
         </w:tc>
@@ -3894,7 +3518,7 @@
                 <wp:inline distT="0" distB="0" distL="0" distR="0">
                   <wp:extent cx="438150" cy="476250"/>
                   <wp:effectExtent t="0" r="0" b="0" l="0"/>
-                  <wp:docPr id="1" name="mobile-specialist.png" descr="Mobile Developer Specialist (O11 and ODC) badge" title="Mobile Developer Specialist (O11 and ODC)"/>
+                  <wp:docPr id="1" name="web-specialist-o11.png" descr="Web Developer Specialist (O11) badge" title="Web Developer Specialist (O11)"/>
                   <wp:cNvGraphicFramePr>
                     <a:graphicFrameLocks xmlns:a="http://schemas.openxmlformats.org/drawingml/2006/main" noChangeAspect="1"/>
                   </wp:cNvGraphicFramePr>
@@ -3955,7 +3579,7 @@
                 <w:sz w:val="22"/>
                 <w:szCs w:val="22"/>
               </w:rPr>
-              <w:t xml:space="preserve">Mobile Developer Specialist (O11 and ODC)</w:t>
+              <w:t xml:space="preserve">Web Developer Specialist (O11)</w:t>
             </w:r>
           </w:p>
           <w:p>
@@ -3971,7 +3595,7 @@
                 <w:sz w:val="17"/>
                 <w:szCs w:val="17"/>
               </w:rPr>
-              <w:t xml:space="preserve">Specialist  ·  Mobile Development  ·  O11 &amp; ODC</w:t>
+              <w:t xml:space="preserve">Specialist  ·  Web Development  ·  O11</w:t>
             </w:r>
           </w:p>
           <w:p>
@@ -3985,7 +3609,7 @@
                 <w:sz w:val="18"/>
                 <w:szCs w:val="18"/>
               </w:rPr>
-              <w:t xml:space="preserve">Cross-platform mobile specialist skills on O11 and ODC</w:t>
+              <w:t xml:space="preserve">Specialist web patterns beyond professional developer baseline</w:t>
             </w:r>
           </w:p>
         </w:tc>
@@ -4016,7 +3640,7 @@
                 <w:sz w:val="18"/>
                 <w:szCs w:val="18"/>
               </w:rPr>
-              <w:t xml:space="preserve">Jun 10, 2023</w:t>
+              <w:t xml:space="preserve">Jul 24, 2023</w:t>
             </w:r>
           </w:p>
         </w:tc>
@@ -4044,6 +3668,21 @@
                 <w:szCs w:val="28"/>
               </w:rPr>
               <w:t xml:space="preserve">●</w:t>
+            </w:r>
+          </w:p>
+          <w:p>
+            <w:pPr>
+              <w:spacing w:after="0" w:before="0"/>
+              <w:jc w:val="center"/>
+            </w:pPr>
+            <w:r>
+              <w:rPr>
+                <w:rFonts w:ascii="Calibri" w:cs="Calibri" w:eastAsia="Calibri" w:hAnsi="Calibri"/>
+                <w:color w:val="F2A0A8"/>
+                <w:sz w:val="22"/>
+                <w:szCs w:val="22"/>
+              </w:rPr>
+              <w:t xml:space="preserve">│</w:t>
             </w:r>
           </w:p>
         </w:tc>
@@ -4067,7 +3706,7 @@
                 <wp:inline distT="0" distB="0" distL="0" distR="0">
                   <wp:extent cx="438150" cy="476250"/>
                   <wp:effectExtent t="0" r="0" b="0" l="0"/>
-                  <wp:docPr id="1" name="associate.png" descr="Associate Developer (O11) badge" title="Associate Developer (O11)"/>
+                  <wp:docPr id="1" name="associate-odc.png" descr="Associate Developer (ODC) badge" title="Associate Developer (ODC)"/>
                   <wp:cNvGraphicFramePr>
                     <a:graphicFrameLocks xmlns:a="http://schemas.openxmlformats.org/drawingml/2006/main" noChangeAspect="1"/>
                   </wp:cNvGraphicFramePr>
@@ -4081,7 +3720,368 @@
                           </pic:cNvPicPr>
                         </pic:nvPicPr>
                         <pic:blipFill>
-                          <a:blip r:embed="rId15" cstate="none"/>
+                          <a:blip r:embed="rId17" cstate="none"/>
+                          <a:srcRect/>
+                          <a:stretch>
+                            <a:fillRect/>
+                          </a:stretch>
+                        </pic:blipFill>
+                        <pic:spPr bwMode="auto">
+                          <a:xfrm>
+                            <a:off x="0" y="0"/>
+                            <a:ext cx="438150" cy="476250"/>
+                          </a:xfrm>
+                          <a:prstGeom prst="rect">
+                            <a:avLst/>
+                          </a:prstGeom>
+                        </pic:spPr>
+                      </pic:pic>
+                    </a:graphicData>
+                  </a:graphic>
+                </wp:inline>
+              </w:drawing>
+            </w:r>
+          </w:p>
+        </w:tc>
+        <w:tc>
+          <w:tcPr>
+            <w:tcW w:type="dxa" w:w="6300"/>
+            <w:tcBorders>
+              <w:top w:val="none" w:color="FFFFFF" w:sz="0"/>
+              <w:left w:val="none" w:color="FFFFFF" w:sz="0"/>
+              <w:bottom w:val="single" w:color="E8EEF0" w:sz="4" w:space="1"/>
+              <w:right w:val="none" w:color="FFFFFF" w:sz="0"/>
+            </w:tcBorders>
+            <w:vAlign w:val="center"/>
+          </w:tcPr>
+          <w:p>
+            <w:pPr>
+              <w:spacing w:after="10" w:before="40"/>
+            </w:pPr>
+            <w:r>
+              <w:rPr>
+                <w:rFonts w:ascii="Calibri" w:cs="Calibri" w:eastAsia="Calibri" w:hAnsi="Calibri"/>
+                <w:b/>
+                <w:bCs/>
+                <w:color w:val="14232B"/>
+                <w:sz w:val="22"/>
+                <w:szCs w:val="22"/>
+              </w:rPr>
+              <w:t xml:space="preserve">Associate Developer (ODC)</w:t>
+            </w:r>
+          </w:p>
+          <w:p>
+            <w:pPr>
+              <w:spacing w:after="10" w:before="0"/>
+            </w:pPr>
+            <w:r>
+              <w:rPr>
+                <w:rFonts w:ascii="Calibri" w:cs="Calibri" w:eastAsia="Calibri" w:hAnsi="Calibri"/>
+                <w:b/>
+                <w:bCs/>
+                <w:color w:val="E4002B"/>
+                <w:sz w:val="17"/>
+                <w:szCs w:val="17"/>
+              </w:rPr>
+              <w:t xml:space="preserve">Associate  ·  Core Development  ·  ODC</w:t>
+            </w:r>
+          </w:p>
+          <w:p>
+            <w:pPr>
+              <w:spacing w:after="50" w:before="0"/>
+            </w:pPr>
+            <w:r>
+              <w:rPr>
+                <w:rFonts w:ascii="Calibri" w:cs="Calibri" w:eastAsia="Calibri" w:hAnsi="Calibri"/>
+                <w:color w:val="3A4D57"/>
+                <w:sz w:val="18"/>
+                <w:szCs w:val="18"/>
+              </w:rPr>
+              <w:t xml:space="preserve">Foundational OutSystems Developer Cloud capability</w:t>
+            </w:r>
+          </w:p>
+        </w:tc>
+      </w:tr>
+      <w:tr>
+        <w:tc>
+          <w:tcPr>
+            <w:tcW w:type="dxa" w:w="1400"/>
+            <w:tcBorders>
+              <w:top w:val="none" w:color="FFFFFF" w:sz="0"/>
+              <w:left w:val="none" w:color="FFFFFF" w:sz="0"/>
+              <w:bottom w:val="none" w:color="FFFFFF" w:sz="0"/>
+              <w:right w:val="none" w:color="FFFFFF" w:sz="0"/>
+            </w:tcBorders>
+            <w:vAlign w:val="center"/>
+          </w:tcPr>
+          <w:p>
+            <w:pPr>
+              <w:spacing w:after="0" w:before="40"/>
+              <w:jc w:val="right"/>
+            </w:pPr>
+            <w:r>
+              <w:rPr>
+                <w:rFonts w:ascii="Calibri" w:cs="Calibri" w:eastAsia="Calibri" w:hAnsi="Calibri"/>
+                <w:b/>
+                <w:bCs/>
+                <w:color w:val="0F4D48"/>
+                <w:sz w:val="18"/>
+                <w:szCs w:val="18"/>
+              </w:rPr>
+              <w:t xml:space="preserve">Jul 13, 2023</w:t>
+            </w:r>
+          </w:p>
+        </w:tc>
+        <w:tc>
+          <w:tcPr>
+            <w:tcW w:type="dxa" w:w="700"/>
+            <w:tcBorders>
+              <w:top w:val="none" w:color="FFFFFF" w:sz="0"/>
+              <w:left w:val="none" w:color="FFFFFF" w:sz="0"/>
+              <w:bottom w:val="none" w:color="FFFFFF" w:sz="0"/>
+              <w:right w:val="none" w:color="FFFFFF" w:sz="0"/>
+            </w:tcBorders>
+            <w:vAlign w:val="center"/>
+          </w:tcPr>
+          <w:p>
+            <w:pPr>
+              <w:spacing w:after="0" w:before="0"/>
+              <w:jc w:val="center"/>
+            </w:pPr>
+            <w:r>
+              <w:rPr>
+                <w:rFonts w:ascii="Calibri" w:cs="Calibri" w:eastAsia="Calibri" w:hAnsi="Calibri"/>
+                <w:color w:val="E4002B"/>
+                <w:sz w:val="28"/>
+                <w:szCs w:val="28"/>
+              </w:rPr>
+              <w:t xml:space="preserve">●</w:t>
+            </w:r>
+          </w:p>
+          <w:p>
+            <w:pPr>
+              <w:spacing w:after="0" w:before="0"/>
+              <w:jc w:val="center"/>
+            </w:pPr>
+            <w:r>
+              <w:rPr>
+                <w:rFonts w:ascii="Calibri" w:cs="Calibri" w:eastAsia="Calibri" w:hAnsi="Calibri"/>
+                <w:color w:val="F2A0A8"/>
+                <w:sz w:val="22"/>
+                <w:szCs w:val="22"/>
+              </w:rPr>
+              <w:t xml:space="preserve">│</w:t>
+            </w:r>
+          </w:p>
+        </w:tc>
+        <w:tc>
+          <w:tcPr>
+            <w:tcW w:type="dxa" w:w="1100"/>
+            <w:tcBorders>
+              <w:top w:val="none" w:color="FFFFFF" w:sz="0"/>
+              <w:left w:val="none" w:color="FFFFFF" w:sz="0"/>
+              <w:bottom w:val="none" w:color="FFFFFF" w:sz="0"/>
+              <w:right w:val="none" w:color="FFFFFF" w:sz="0"/>
+            </w:tcBorders>
+            <w:vAlign w:val="center"/>
+          </w:tcPr>
+          <w:p>
+            <w:pPr>
+              <w:spacing w:after="20" w:before="20"/>
+            </w:pPr>
+            <w:r>
+              <w:drawing>
+                <wp:inline distT="0" distB="0" distL="0" distR="0">
+                  <wp:extent cx="438150" cy="476250"/>
+                  <wp:effectExtent t="0" r="0" b="0" l="0"/>
+                  <wp:docPr id="1" name="mobile-specialist.png" descr="Mobile Developer Specialist (O11 and ODC) badge" title="Mobile Developer Specialist (O11 and ODC)"/>
+                  <wp:cNvGraphicFramePr>
+                    <a:graphicFrameLocks xmlns:a="http://schemas.openxmlformats.org/drawingml/2006/main" noChangeAspect="1"/>
+                  </wp:cNvGraphicFramePr>
+                  <a:graphic xmlns:a="http://schemas.openxmlformats.org/drawingml/2006/main">
+                    <a:graphicData uri="http://schemas.openxmlformats.org/drawingml/2006/picture">
+                      <pic:pic xmlns:pic="http://schemas.openxmlformats.org/drawingml/2006/picture">
+                        <pic:nvPicPr>
+                          <pic:cNvPr id="0" name="" descr=""/>
+                          <pic:cNvPicPr>
+                            <a:picLocks noChangeAspect="1" noChangeArrowheads="1"/>
+                          </pic:cNvPicPr>
+                        </pic:nvPicPr>
+                        <pic:blipFill>
+                          <a:blip r:embed="rId18" cstate="none"/>
+                          <a:srcRect/>
+                          <a:stretch>
+                            <a:fillRect/>
+                          </a:stretch>
+                        </pic:blipFill>
+                        <pic:spPr bwMode="auto">
+                          <a:xfrm>
+                            <a:off x="0" y="0"/>
+                            <a:ext cx="438150" cy="476250"/>
+                          </a:xfrm>
+                          <a:prstGeom prst="rect">
+                            <a:avLst/>
+                          </a:prstGeom>
+                        </pic:spPr>
+                      </pic:pic>
+                    </a:graphicData>
+                  </a:graphic>
+                </wp:inline>
+              </w:drawing>
+            </w:r>
+          </w:p>
+        </w:tc>
+        <w:tc>
+          <w:tcPr>
+            <w:tcW w:type="dxa" w:w="6300"/>
+            <w:tcBorders>
+              <w:top w:val="none" w:color="FFFFFF" w:sz="0"/>
+              <w:left w:val="none" w:color="FFFFFF" w:sz="0"/>
+              <w:bottom w:val="single" w:color="E8EEF0" w:sz="4" w:space="1"/>
+              <w:right w:val="none" w:color="FFFFFF" w:sz="0"/>
+            </w:tcBorders>
+            <w:vAlign w:val="center"/>
+          </w:tcPr>
+          <w:p>
+            <w:pPr>
+              <w:spacing w:after="10" w:before="40"/>
+            </w:pPr>
+            <w:r>
+              <w:rPr>
+                <w:rFonts w:ascii="Calibri" w:cs="Calibri" w:eastAsia="Calibri" w:hAnsi="Calibri"/>
+                <w:b/>
+                <w:bCs/>
+                <w:color w:val="14232B"/>
+                <w:sz w:val="22"/>
+                <w:szCs w:val="22"/>
+              </w:rPr>
+              <w:t xml:space="preserve">Mobile Developer Specialist (O11 and ODC)</w:t>
+            </w:r>
+          </w:p>
+          <w:p>
+            <w:pPr>
+              <w:spacing w:after="10" w:before="0"/>
+            </w:pPr>
+            <w:r>
+              <w:rPr>
+                <w:rFonts w:ascii="Calibri" w:cs="Calibri" w:eastAsia="Calibri" w:hAnsi="Calibri"/>
+                <w:b/>
+                <w:bCs/>
+                <w:color w:val="E4002B"/>
+                <w:sz w:val="17"/>
+                <w:szCs w:val="17"/>
+              </w:rPr>
+              <w:t xml:space="preserve">Specialist  ·  Mobile Development  ·  O11 &amp; ODC</w:t>
+            </w:r>
+          </w:p>
+          <w:p>
+            <w:pPr>
+              <w:spacing w:after="50" w:before="0"/>
+            </w:pPr>
+            <w:r>
+              <w:rPr>
+                <w:rFonts w:ascii="Calibri" w:cs="Calibri" w:eastAsia="Calibri" w:hAnsi="Calibri"/>
+                <w:color w:val="3A4D57"/>
+                <w:sz w:val="18"/>
+                <w:szCs w:val="18"/>
+              </w:rPr>
+              <w:t xml:space="preserve">Cross-platform mobile specialist skills on O11 and ODC</w:t>
+            </w:r>
+          </w:p>
+        </w:tc>
+      </w:tr>
+      <w:tr>
+        <w:tc>
+          <w:tcPr>
+            <w:tcW w:type="dxa" w:w="1400"/>
+            <w:tcBorders>
+              <w:top w:val="none" w:color="FFFFFF" w:sz="0"/>
+              <w:left w:val="none" w:color="FFFFFF" w:sz="0"/>
+              <w:bottom w:val="none" w:color="FFFFFF" w:sz="0"/>
+              <w:right w:val="none" w:color="FFFFFF" w:sz="0"/>
+            </w:tcBorders>
+            <w:vAlign w:val="center"/>
+          </w:tcPr>
+          <w:p>
+            <w:pPr>
+              <w:spacing w:after="0" w:before="40"/>
+              <w:jc w:val="right"/>
+            </w:pPr>
+            <w:r>
+              <w:rPr>
+                <w:rFonts w:ascii="Calibri" w:cs="Calibri" w:eastAsia="Calibri" w:hAnsi="Calibri"/>
+                <w:b/>
+                <w:bCs/>
+                <w:color w:val="0F4D48"/>
+                <w:sz w:val="18"/>
+                <w:szCs w:val="18"/>
+              </w:rPr>
+              <w:t xml:space="preserve">Jun 10, 2023</w:t>
+            </w:r>
+          </w:p>
+        </w:tc>
+        <w:tc>
+          <w:tcPr>
+            <w:tcW w:type="dxa" w:w="700"/>
+            <w:tcBorders>
+              <w:top w:val="none" w:color="FFFFFF" w:sz="0"/>
+              <w:left w:val="none" w:color="FFFFFF" w:sz="0"/>
+              <w:bottom w:val="none" w:color="FFFFFF" w:sz="0"/>
+              <w:right w:val="none" w:color="FFFFFF" w:sz="0"/>
+            </w:tcBorders>
+            <w:vAlign w:val="center"/>
+          </w:tcPr>
+          <w:p>
+            <w:pPr>
+              <w:spacing w:after="0" w:before="0"/>
+              <w:jc w:val="center"/>
+            </w:pPr>
+            <w:r>
+              <w:rPr>
+                <w:rFonts w:ascii="Calibri" w:cs="Calibri" w:eastAsia="Calibri" w:hAnsi="Calibri"/>
+                <w:color w:val="E4002B"/>
+                <w:sz w:val="28"/>
+                <w:szCs w:val="28"/>
+              </w:rPr>
+              <w:t xml:space="preserve">●</w:t>
+            </w:r>
+          </w:p>
+        </w:tc>
+        <w:tc>
+          <w:tcPr>
+            <w:tcW w:type="dxa" w:w="1100"/>
+            <w:tcBorders>
+              <w:top w:val="none" w:color="FFFFFF" w:sz="0"/>
+              <w:left w:val="none" w:color="FFFFFF" w:sz="0"/>
+              <w:bottom w:val="none" w:color="FFFFFF" w:sz="0"/>
+              <w:right w:val="none" w:color="FFFFFF" w:sz="0"/>
+            </w:tcBorders>
+            <w:vAlign w:val="center"/>
+          </w:tcPr>
+          <w:p>
+            <w:pPr>
+              <w:spacing w:after="20" w:before="20"/>
+            </w:pPr>
+            <w:r>
+              <w:drawing>
+                <wp:inline distT="0" distB="0" distL="0" distR="0">
+                  <wp:extent cx="438150" cy="476250"/>
+                  <wp:effectExtent t="0" r="0" b="0" l="0"/>
+                  <wp:docPr id="1" name="associate-o11.png" descr="Associate Developer (O11) badge" title="Associate Developer (O11)"/>
+                  <wp:cNvGraphicFramePr>
+                    <a:graphicFrameLocks xmlns:a="http://schemas.openxmlformats.org/drawingml/2006/main" noChangeAspect="1"/>
+                  </wp:cNvGraphicFramePr>
+                  <a:graphic xmlns:a="http://schemas.openxmlformats.org/drawingml/2006/main">
+                    <a:graphicData uri="http://schemas.openxmlformats.org/drawingml/2006/picture">
+                      <pic:pic xmlns:pic="http://schemas.openxmlformats.org/drawingml/2006/picture">
+                        <pic:nvPicPr>
+                          <pic:cNvPr id="0" name="" descr=""/>
+                          <pic:cNvPicPr>
+                            <a:picLocks noChangeAspect="1" noChangeArrowheads="1"/>
+                          </pic:cNvPicPr>
+                        </pic:nvPicPr>
+                        <pic:blipFill>
+                          <a:blip r:embed="rId19" cstate="none"/>
                           <a:srcRect/>
                           <a:stretch>
                             <a:fillRect/>

</xml_diff>

<commit_message>
Remove CV footer generation line
Drop the "Curriculum Vitae generated from..." note so the CV ends
cleanly on content without leaving a sparse trailing page.

Co-authored-by: myounusm <myounusm@users.noreply.github.com>
</commit_message>
<xml_diff>
--- a/public/Mohammed_Younus_CV.docx
+++ b/public/Mohammed_Younus_CV.docx
@@ -1622,23 +1622,6 @@
           <w:szCs w:val="22"/>
         </w:rPr>
         <w:t xml:space="preserve">Microsoft Certified: Azure AI Fundamentals · Microsoft 365 Certified: Fundamentals · SCRUM Fundamentals</w:t>
-      </w:r>
-    </w:p>
-    <w:p>
-      <w:pPr>
-        <w:spacing w:before="280"/>
-        <w:jc w:val="center"/>
-      </w:pPr>
-      <w:r>
-        <w:rPr>
-          <w:rFonts w:ascii="Calibri" w:cs="Calibri" w:eastAsia="Calibri" w:hAnsi="Calibri"/>
-          <w:i/>
-          <w:iCs/>
-          <w:color w:val="3A4D57"/>
-          <w:sz w:val="18"/>
-          <w:szCs w:val="18"/>
-        </w:rPr>
-        <w:t xml:space="preserve">Curriculum Vitae generated from https://www.myounusm.in · Mohammed Younus Mohiuddin</w:t>
       </w:r>
     </w:p>
     <w:p>

</xml_diff>